<commit_message>
fix(script): cap nhat dung so lieu KTC W40: 45.6% TLTD va 124 xe non tai <30% thay cho so cu W38
</commit_message>
<xml_diff>
--- a/KICH_BAN_THUYET_TRINH_W40_NAM_TRUNG_BO.docx
+++ b/KICH_BAN_THUYET_TRINH_W40_NAM_TRUNG_BO.docx
@@ -437,7 +437,7 @@
                 <w:color w:val="1F2937"/>
                 <w:sz w:val="22"/>
               </w:rPr>
-              <w:t>Thứ hai: Khâu vận tải KTC vẫn đang gánh 76 chuyến xe chạy non tải dưới 30% thùng, kéo tỷ lệ lấp đầy KTC đứng yên ở mức 51,0%, gây lãng phí chi phí nhiên liệu đường trục.</w:t>
+              <w:t>Thứ hai: Khâu vận tải KTC đang báo động đỏ khi tỷ lệ lấp đầy thùng xe tụt xuống chỉ còn 45,6% (giảm -2,1%p so với 47,7% tuần W39), và số chuyến xe chạy non tải dưới 30% thùng xe tăng vọt lên tới 124 chuyến (chiếm gần một phần tư tổng số 513 chuyến KTC toàn vùng), gây lãng phí rất lớn chi phí nhiên liệu đường trục.</w:t>
             </w:r>
           </w:p>
           <w:p>
@@ -563,7 +563,7 @@
                 <w:color w:val="991B1B"/>
                 <w:sz w:val="21"/>
               </w:rPr>
-              <w:t>• 76 chuyến xe KTC chạy non tải dưới 30% thùng làm xói mòn biên lợi nhuận vận hành của vùng.</w:t>
+              <w:t>• 124 chuyến xe KTC chạy non tải dưới 30% thùng (chiếm 24,2% tổng số chuyến) làm xói mòn nghiêm trọng biên lợi nhuận vận hành của vùng.</w:t>
             </w:r>
           </w:p>
           <w:p>
@@ -595,7 +595,7 @@
                 <w:color w:val="14532D"/>
                 <w:sz w:val="21"/>
               </w:rPr>
-              <w:t>• Tuần W41 tập trung 3 mũi nhọn: Truy thu dứt điểm 187,1 Tr ₫ công nợ, tối ưu gộp chuyến 76 xe KTC non tải và cứu vãn ODR tại các bưu cục vùng sâu.</w:t>
+              <w:t>• Tuần W41 tập trung 3 mũi nhọn: Truy thu dứt điểm 187,1 Tr ₫ công nợ, tối ưu gộp chuyến 124 xe KTC non tải và cứu vãn ODR tại các bưu cục vùng sâu.</w:t>
             </w:r>
           </w:p>
         </w:tc>
@@ -5068,7 +5068,7 @@
           <w:color w:val="0F4C81"/>
           <w:sz w:val="26"/>
         </w:rPr>
-        <w:t>🚛 [XI. BÁO CÁO ĐIỀU HÀNH KTC, VẬN TẢI, %TLTĐ THÙNG XE (51.0%) &amp; LEADTIME KHO (W40)]</w:t>
+        <w:t>🚛 [XI. BÁO CÁO ĐIỀU HÀNH KTC, VẬN TẢI, %TLTĐ THÙNG XE (45.6%) &amp; 124 CHUYẾN NON TẢI (W40)]</w:t>
       </w:r>
     </w:p>
     <w:tbl>
@@ -5111,82 +5111,157 @@
                 <w:color w:val="EA580C"/>
                 <w:sz w:val="23"/>
               </w:rPr>
-              <w:t>🗣️ HIỆU QUẢ VẬN TẢI KTC: XỬ LÝ 76 CHUYẾN XE NON TẢI DƯỚI 30% THÙNG (TAB 12):</w:t>
-            </w:r>
-          </w:p>
-          <w:p>
-            <w:pPr>
-              <w:spacing w:before="40" w:after="80" w:line="276" w:lineRule="auto"/>
-            </w:pPr>
-            <w:r>
-              <w:rPr>
-                <w:rFonts w:ascii="Times New Roman" w:hAnsi="Times New Roman"/>
-                <w:b w:val="0"/>
-                <w:i w:val="0"/>
-                <w:color w:val="1F2937"/>
-                <w:sz w:val="22"/>
-              </w:rPr>
-              <w:t>📍 1. BẢNG CHỈ SỐ VẬN TẢI &amp; KHO KTC (W40):</w:t>
-            </w:r>
-          </w:p>
-          <w:p>
-            <w:pPr>
-              <w:spacing w:before="40" w:after="80" w:line="276" w:lineRule="auto"/>
-            </w:pPr>
-            <w:r>
-              <w:rPr>
-                <w:rFonts w:ascii="Times New Roman" w:hAnsi="Times New Roman"/>
-                <w:b w:val="0"/>
-                <w:i w:val="0"/>
-                <w:color w:val="1F2937"/>
-                <w:sz w:val="22"/>
-              </w:rPr>
-              <w:t>• Tỷ Lệ Lấp Đầy Thùng Xe KTC (%TLTĐ): Đạt 51,0% (đứng yên so với W39, cách rất xa mục tiêu tối ưu ≥ 58,0%).</w:t>
-            </w:r>
-          </w:p>
-          <w:p>
-            <w:pPr>
-              <w:spacing w:before="40" w:after="80" w:line="276" w:lineRule="auto"/>
-            </w:pPr>
-            <w:r>
-              <w:rPr>
-                <w:rFonts w:ascii="Times New Roman" w:hAnsi="Times New Roman"/>
-                <w:b w:val="0"/>
-                <w:i w:val="0"/>
-                <w:color w:val="1F2937"/>
-                <w:sz w:val="22"/>
-              </w:rPr>
-              <w:t>• Số chuyến xe chạy non tải (&lt;30% thùng xe): Ghi nhận 76 chuyến xuất bến trong tuần!</w:t>
-            </w:r>
-          </w:p>
-          <w:p>
-            <w:pPr>
-              <w:spacing w:before="40" w:after="80" w:line="276" w:lineRule="auto"/>
-            </w:pPr>
-            <w:r>
-              <w:rPr>
-                <w:rFonts w:ascii="Times New Roman" w:hAnsi="Times New Roman"/>
-                <w:b w:val="0"/>
-                <w:i w:val="0"/>
-                <w:color w:val="1F2937"/>
-                <w:sz w:val="22"/>
-              </w:rPr>
-              <w:t>• Tổng số chuyến xe KTC vận hành toàn vùng: 532 chuyến.</w:t>
-            </w:r>
-          </w:p>
-          <w:p>
-            <w:pPr>
-              <w:spacing w:before="40" w:after="80" w:line="276" w:lineRule="auto"/>
-            </w:pPr>
-            <w:r>
-              <w:rPr>
-                <w:rFonts w:ascii="Times New Roman" w:hAnsi="Times New Roman"/>
-                <w:b w:val="0"/>
-                <w:i w:val="0"/>
-                <w:color w:val="1F2937"/>
-                <w:sz w:val="22"/>
-              </w:rPr>
-              <w:t>• Leadtime xử lý tại các kho KTC trung chuyển: KTC Nha Trang đạt 1,8 giờ | KTC Phan Thiết đạt 2,1 giờ | KTC Đức Trọng đạt 3,4 giờ (chậm nhất vùng do nghẽn ca đêm).</w:t>
+              <w:t>🗣️ HIỆU QUẢ VẬN TẢI KTC: XỬ LÝ 124 CHUYẾN XE NON TẢI DƯỚI 30% THÙNG (TAB 12):</w:t>
+            </w:r>
+          </w:p>
+          <w:p>
+            <w:pPr>
+              <w:spacing w:before="40" w:after="80" w:line="276" w:lineRule="auto"/>
+            </w:pPr>
+            <w:r>
+              <w:rPr>
+                <w:rFonts w:ascii="Times New Roman" w:hAnsi="Times New Roman"/>
+                <w:b w:val="0"/>
+                <w:i w:val="0"/>
+                <w:color w:val="1F2937"/>
+                <w:sz w:val="22"/>
+              </w:rPr>
+              <w:t>📍 1. BẢNG CHỈ SỐ VẬN TẢI &amp; KHO KTC (W40 vs W39):</w:t>
+            </w:r>
+          </w:p>
+          <w:p>
+            <w:pPr>
+              <w:spacing w:before="40" w:after="80" w:line="276" w:lineRule="auto"/>
+            </w:pPr>
+            <w:r>
+              <w:rPr>
+                <w:rFonts w:ascii="Times New Roman" w:hAnsi="Times New Roman"/>
+                <w:b w:val="0"/>
+                <w:i w:val="0"/>
+                <w:color w:val="1F2937"/>
+                <w:sz w:val="22"/>
+              </w:rPr>
+              <w:t>• Tỷ Lệ Lấp Đầy Thùng Xe KTC (%TLTĐ Toàn Vùng): Đạt 45,6% (W39: 47,7%, tụt giảm -2,1%p, cách rất xa mục tiêu tối ưu ≥ 55,0%).</w:t>
+            </w:r>
+          </w:p>
+          <w:p>
+            <w:pPr>
+              <w:spacing w:before="40" w:after="80" w:line="276" w:lineRule="auto"/>
+            </w:pPr>
+            <w:r>
+              <w:rPr>
+                <w:rFonts w:ascii="Times New Roman" w:hAnsi="Times New Roman"/>
+                <w:b w:val="0"/>
+                <w:i w:val="0"/>
+                <w:color w:val="1F2937"/>
+                <w:sz w:val="22"/>
+              </w:rPr>
+              <w:t>• Số chuyến xe chạy non tải (&lt;30% thùng xe): Ghi nhận tới 124 chuyến xuất bến trong tuần (chiếm 24,2% tổng số 513 chuyến KTC), trong đó có 7 chuyến rỗng dưới 10%, 32 chuyến dưới 20% và 37 chuyến dưới 30%!</w:t>
+            </w:r>
+          </w:p>
+          <w:p>
+            <w:pPr>
+              <w:spacing w:before="40" w:after="80" w:line="276" w:lineRule="auto"/>
+            </w:pPr>
+            <w:r>
+              <w:rPr>
+                <w:rFonts w:ascii="Times New Roman" w:hAnsi="Times New Roman"/>
+                <w:b w:val="0"/>
+                <w:i w:val="0"/>
+                <w:color w:val="1F2937"/>
+                <w:sz w:val="22"/>
+              </w:rPr>
+              <w:t>• Tổng số chuyến xe KTC vận hành toàn vùng: 513 chuyến (giảm 14 chuyến so với 527 chuyến W39).</w:t>
+            </w:r>
+          </w:p>
+          <w:p>
+            <w:pPr>
+              <w:spacing w:before="40" w:after="80" w:line="276" w:lineRule="auto"/>
+            </w:pPr>
+            <w:r>
+              <w:rPr>
+                <w:rFonts w:ascii="Times New Roman" w:hAnsi="Times New Roman"/>
+                <w:b w:val="0"/>
+                <w:i w:val="0"/>
+                <w:color w:val="1F2937"/>
+                <w:sz w:val="22"/>
+              </w:rPr>
+              <w:t>• Chi tiết 5 kho KTC trọng điểm:</w:t>
+            </w:r>
+          </w:p>
+          <w:p>
+            <w:pPr>
+              <w:spacing w:before="40" w:after="80" w:line="276" w:lineRule="auto"/>
+            </w:pPr>
+            <w:r>
+              <w:rPr>
+                <w:rFonts w:ascii="Times New Roman" w:hAnsi="Times New Roman"/>
+                <w:b w:val="0"/>
+                <w:i w:val="0"/>
+                <w:color w:val="1F2937"/>
+                <w:sz w:val="22"/>
+              </w:rPr>
+              <w:t xml:space="preserve">  - KTC Khánh Hòa: 193 chuyến | TLTĐ 52,3% (-2,6%p) | 20 xe non tải &lt;30%.</w:t>
+            </w:r>
+          </w:p>
+          <w:p>
+            <w:pPr>
+              <w:spacing w:before="40" w:after="80" w:line="276" w:lineRule="auto"/>
+            </w:pPr>
+            <w:r>
+              <w:rPr>
+                <w:rFonts w:ascii="Times New Roman" w:hAnsi="Times New Roman"/>
+                <w:b w:val="0"/>
+                <w:i w:val="0"/>
+                <w:color w:val="1F2937"/>
+                <w:sz w:val="22"/>
+              </w:rPr>
+              <w:t xml:space="preserve">  - KTC Đức Trọng - Lâm Đồng: 110 chuyến | TLTĐ 40,6% (-4,5%p) | 43 xe non tải &lt;30% ➔ ĐIỂM NÓNG LÃNG PHÍ LỚN NHẤT VÙNG!</w:t>
+            </w:r>
+          </w:p>
+          <w:p>
+            <w:pPr>
+              <w:spacing w:before="40" w:after="80" w:line="276" w:lineRule="auto"/>
+            </w:pPr>
+            <w:r>
+              <w:rPr>
+                <w:rFonts w:ascii="Times New Roman" w:hAnsi="Times New Roman"/>
+                <w:b w:val="0"/>
+                <w:i w:val="0"/>
+                <w:color w:val="1F2937"/>
+                <w:sz w:val="22"/>
+              </w:rPr>
+              <w:t xml:space="preserve">  - KTC Bình Thuận: 113 chuyến | TLTĐ 47,7% (+1,1%p) | 20 xe non tải &lt;30%.</w:t>
+            </w:r>
+          </w:p>
+          <w:p>
+            <w:pPr>
+              <w:spacing w:before="40" w:after="80" w:line="276" w:lineRule="auto"/>
+            </w:pPr>
+            <w:r>
+              <w:rPr>
+                <w:rFonts w:ascii="Times New Roman" w:hAnsi="Times New Roman"/>
+                <w:b w:val="0"/>
+                <w:i w:val="0"/>
+                <w:color w:val="1F2937"/>
+                <w:sz w:val="22"/>
+              </w:rPr>
+              <w:t xml:space="preserve">  - KTC Bảo Lộc - Lâm Đồng: 55 chuyến | TLTĐ 38,2% (-1,6%p) | 19 xe non tải &lt;30%.</w:t>
+            </w:r>
+          </w:p>
+          <w:p>
+            <w:pPr>
+              <w:spacing w:before="40" w:after="80" w:line="276" w:lineRule="auto"/>
+            </w:pPr>
+            <w:r>
+              <w:rPr>
+                <w:rFonts w:ascii="Times New Roman" w:hAnsi="Times New Roman"/>
+                <w:b w:val="0"/>
+                <w:i w:val="0"/>
+                <w:color w:val="1F2937"/>
+                <w:sz w:val="22"/>
+              </w:rPr>
+              <w:t xml:space="preserve">  - KTC Đắk Nông: 42 chuyến | TLTĐ 31,3% (-1,9%p) | 22 xe non tải &lt;30% (hơn một nửa số chuyến chạy non tải).</w:t>
             </w:r>
           </w:p>
           <w:p>
@@ -5216,22 +5291,22 @@
                 <w:color w:val="1F2937"/>
                 <w:sz w:val="22"/>
               </w:rPr>
-              <w:t>• 76 chuyến xe non tải dưới 30% thùng xe đang làm lãng phí hàng trăm triệu đồng tiền dầu và khấu hao phương tiện.</w:t>
-            </w:r>
-          </w:p>
-          <w:p>
-            <w:pPr>
-              <w:spacing w:before="40" w:after="80" w:line="276" w:lineRule="auto"/>
-            </w:pPr>
-            <w:r>
-              <w:rPr>
-                <w:rFonts w:ascii="Times New Roman" w:hAnsi="Times New Roman"/>
-                <w:b w:val="0"/>
-                <w:i w:val="0"/>
-                <w:color w:val="1F2937"/>
-                <w:sz w:val="22"/>
-              </w:rPr>
-              <w:t>• Các hợp đồng xe thuê ngoài nhà xe Mạnh Cường chạy các tuyến bưu cục huyện (chi phí từ 22 đến 31 triệu/tháng/xe) cần rà soát lại hệ số sử dụng.</w:t>
+              <w:t>• 124 chuyến xe non tải dưới 30% thùng xe đang trực tiếp làm lãng phí hàng trăm triệu đồng tiền dầu và chi phí thuê xe.</w:t>
+            </w:r>
+          </w:p>
+          <w:p>
+            <w:pPr>
+              <w:spacing w:before="40" w:after="80" w:line="276" w:lineRule="auto"/>
+            </w:pPr>
+            <w:r>
+              <w:rPr>
+                <w:rFonts w:ascii="Times New Roman" w:hAnsi="Times New Roman"/>
+                <w:b w:val="0"/>
+                <w:i w:val="0"/>
+                <w:color w:val="1F2937"/>
+                <w:sz w:val="22"/>
+              </w:rPr>
+              <w:t>• Tuyến Đức Trọng - Lâm Đồng và Đắk Nông cần tái cấu trúc ngay lịch xuất bến xe tải.</w:t>
             </w:r>
           </w:p>
           <w:p>
@@ -5276,52 +5351,82 @@
                 <w:color w:val="1F2937"/>
                 <w:sz w:val="22"/>
               </w:rPr>
-              <w:t>Mọi người nhìn vào con số %TLTĐ thùng xe tuần này: Vẫn đang dậm chân tại chỗ ở mức 51,0%!</w:t>
-            </w:r>
-          </w:p>
-          <w:p>
-            <w:pPr>
-              <w:spacing w:before="40" w:after="80" w:line="276" w:lineRule="auto"/>
-            </w:pPr>
-            <w:r>
-              <w:rPr>
-                <w:rFonts w:ascii="Times New Roman" w:hAnsi="Times New Roman"/>
-                <w:b w:val="0"/>
-                <w:i w:val="0"/>
-                <w:color w:val="1F2937"/>
-                <w:sz w:val="22"/>
-              </w:rPr>
-              <w:t>Và trên hệ thống giám sát hành trình tuần qua phát hiện có tới 76 chuyến xe tải KTC lăn bánh trên đường với tỷ lệ lấp đầy thùng dưới 30%!</w:t>
-            </w:r>
-          </w:p>
-          <w:p>
-            <w:pPr>
-              <w:spacing w:before="40" w:after="80" w:line="276" w:lineRule="auto"/>
-            </w:pPr>
-            <w:r>
-              <w:rPr>
-                <w:rFonts w:ascii="Times New Roman" w:hAnsi="Times New Roman"/>
-                <w:b w:val="0"/>
-                <w:i w:val="0"/>
-                <w:color w:val="1F2937"/>
-                <w:sz w:val="22"/>
-              </w:rPr>
-              <w:t>Tức là chiếc xe thùng dài chạy từ Nha Trang vào Phan Thiết hay từ Đức Trọng về Bảo Lộc mà bên trong chỉ chở được có vài chục bao hàng, thùng xe rỗng tới hơn hai phần ba!</w:t>
-            </w:r>
-          </w:p>
-          <w:p>
-            <w:pPr>
-              <w:spacing w:before="40" w:after="80" w:line="276" w:lineRule="auto"/>
-            </w:pPr>
-            <w:r>
-              <w:rPr>
-                <w:rFonts w:ascii="Times New Roman" w:hAnsi="Times New Roman"/>
-                <w:b w:val="0"/>
-                <w:i w:val="0"/>
-                <w:color w:val="1F2937"/>
-                <w:sz w:val="22"/>
-              </w:rPr>
-              <w:t>Chúng ta đang trả nguyên tiền cước xe, tiền dầu, tiền cầu đường cho một chuyến xe rỗng.</w:t>
+              <w:t>Mọi người nhìn vào con số %TLTĐ thùng xe tuần này: Rất đáng lo ngại khi tụt từ 47,7% xuống chỉ còn 45,6%, giảm mất -2,1%p!</w:t>
+            </w:r>
+          </w:p>
+          <w:p>
+            <w:pPr>
+              <w:spacing w:before="40" w:after="80" w:line="276" w:lineRule="auto"/>
+            </w:pPr>
+            <w:r>
+              <w:rPr>
+                <w:rFonts w:ascii="Times New Roman" w:hAnsi="Times New Roman"/>
+                <w:b w:val="0"/>
+                <w:i w:val="0"/>
+                <w:color w:val="1F2937"/>
+                <w:sz w:val="22"/>
+              </w:rPr>
+              <w:t>Và trên hệ thống giám sát hành trình tuần qua phát hiện có tới 124 CHUYẾN XE TẢI KTC lăn bánh trên đường với tỷ lệ lấp đầy thùng dưới 30%!</w:t>
+            </w:r>
+          </w:p>
+          <w:p>
+            <w:pPr>
+              <w:spacing w:before="40" w:after="80" w:line="276" w:lineRule="auto"/>
+            </w:pPr>
+            <w:r>
+              <w:rPr>
+                <w:rFonts w:ascii="Times New Roman" w:hAnsi="Times New Roman"/>
+                <w:b w:val="0"/>
+                <w:i w:val="0"/>
+                <w:color w:val="1F2937"/>
+                <w:sz w:val="22"/>
+              </w:rPr>
+              <w:t>Trong tổng số 513 chuyến xe toàn vùng, thì cứ 4 chuyến xe chạy trên đường lại có 1 chuyến chạy non tải, thậm chí có 7 chuyến xe gần như rỗng không dưới 10% thùng xe!</w:t>
+            </w:r>
+          </w:p>
+          <w:p>
+            <w:pPr>
+              <w:spacing w:before="40" w:after="80" w:line="276" w:lineRule="auto"/>
+            </w:pPr>
+            <w:r>
+              <w:rPr>
+                <w:rFonts w:ascii="Times New Roman" w:hAnsi="Times New Roman"/>
+                <w:b w:val="0"/>
+                <w:i w:val="0"/>
+                <w:color w:val="1F2937"/>
+                <w:sz w:val="22"/>
+              </w:rPr>
+              <w:t>Điểm nóng nhất nằm ở đâu?</w:t>
+            </w:r>
+          </w:p>
+          <w:p>
+            <w:pPr>
+              <w:spacing w:before="40" w:after="80" w:line="276" w:lineRule="auto"/>
+            </w:pPr>
+            <w:r>
+              <w:rPr>
+                <w:rFonts w:ascii="Times New Roman" w:hAnsi="Times New Roman"/>
+                <w:b w:val="0"/>
+                <w:i w:val="0"/>
+                <w:color w:val="1F2937"/>
+                <w:sz w:val="22"/>
+              </w:rPr>
+              <w:t>Chính là KTC Đức Trọng ở Lâm Đồng: Một mình Đức Trọng gánh tới 43 chuyến xe non tải, tỷ lệ lấp đầy rơi tự do xuống 40,6%! Kế tiếp là Đắk Nông với 22 chuyến non tải, tỷ lệ lấp đầy chỉ vỏn vẹn 31,3% — tức là thùng xe rỗng tới hơn hai phần ba!</w:t>
+            </w:r>
+          </w:p>
+          <w:p>
+            <w:pPr>
+              <w:spacing w:before="40" w:after="80" w:line="276" w:lineRule="auto"/>
+            </w:pPr>
+            <w:r>
+              <w:rPr>
+                <w:rFonts w:ascii="Times New Roman" w:hAnsi="Times New Roman"/>
+                <w:b w:val="0"/>
+                <w:i w:val="0"/>
+                <w:color w:val="1F2937"/>
+                <w:sz w:val="22"/>
+              </w:rPr>
+              <w:t>Chúng ta đang trả nguyên tiền cước xe, tiền dầu, tiền cầu đường cho những chuyến xe chở gió.</w:t>
             </w:r>
           </w:p>
           <w:p>
@@ -5351,21 +5456,6 @@
                 <w:color w:val="1F2937"/>
                 <w:sz w:val="22"/>
               </w:rPr>
-              <w:t>Bên cạnh đó, thời gian Leadtime tại KTC Đức Trọng lên tới 3,4 giờ, trong khi Nha Trang chỉ mất 1,8 giờ. Hàng xe tải đổ xuống KTC Đức Trọng bị ngâm quá lâu mới được đưa lên băng chuyền.</w:t>
-            </w:r>
-          </w:p>
-          <w:p>
-            <w:pPr>
-              <w:spacing w:before="40" w:after="80" w:line="276" w:lineRule="auto"/>
-            </w:pPr>
-            <w:r>
-              <w:rPr>
-                <w:rFonts w:ascii="Times New Roman" w:hAnsi="Times New Roman"/>
-                <w:b w:val="0"/>
-                <w:i w:val="0"/>
-                <w:color w:val="1F2937"/>
-                <w:sz w:val="22"/>
-              </w:rPr>
               <w:t>Em đề xuất Ban Vận tải trong tuần W41 này:</w:t>
             </w:r>
           </w:p>
@@ -5381,7 +5471,7 @@
                 <w:color w:val="1F2937"/>
                 <w:sz w:val="22"/>
               </w:rPr>
-              <w:t>Phải rà soát ngay 76 chuyến xe non tải này: Tuyến nào sản lượng ít thì gộp 2 chuyến làm một hoặc chuyển sang dùng xe tải nhỏ 1,5 tấn. Tuyệt đối không cho xe chạy rỗng đường dài để bảo vệ chi phí vận hành của vùng!"</w:t>
+              <w:t>Phải rà soát và xử lý ngay 124 chuyến xe non tải này: Tuyến nào sản lượng ít thì gộp 2 chuyến làm một hoặc chuyển sang dùng xe tải nhỏ 1,5 tấn. Tuyệt đối không cho xe chạy rỗng đường dài để bảo vệ chi phí vận hành của vùng!"</w:t>
             </w:r>
           </w:p>
           <w:p>
@@ -5429,7 +5519,7 @@
                 <w:color w:val="1F2937"/>
                 <w:sz w:val="21"/>
               </w:rPr>
-              <w:t>• KTC Đức Trọng cần cải tổ quy trình chia chọn để rút ngắn Leadtime từ 3,4 giờ về dưới 2,0 giờ.</w:t>
+              <w:t>• KTC Đức Trọng (43 xe non tải) và Đắk Nông (31,3% TLTĐ) là hai nút thắt trọng điểm cần tối ưu hóa phương tiện.</w:t>
             </w:r>
           </w:p>
           <w:p>
@@ -5461,7 +5551,7 @@
                 <w:color w:val="991B1B"/>
                 <w:sz w:val="21"/>
               </w:rPr>
-              <w:t>• 76 chuyến xe non tải trực tiếp làm đội chi phí trên mỗi đơn hàng (Cost Per Order - CPO) của vùng Nam Trung Bộ.</w:t>
+              <w:t>• 124 chuyến xe non tải trực tiếp làm đội chi phí trên mỗi đơn hàng (Cost Per Order - CPO) của vùng Nam Trung Bộ.</w:t>
             </w:r>
           </w:p>
           <w:p>
@@ -8215,7 +8305,7 @@
                 <w:color w:val="1F2937"/>
                 <w:sz w:val="22"/>
               </w:rPr>
-              <w:t>• Trọng tâm 4: Tối ưu chi phí vận tải: Gộp tuyến và cắt giảm 76 chuyến xe KTC non tải &lt;30% thùng để đưa %TLTĐ vượt mốc 55%.</w:t>
+              <w:t>• Trọng tâm 4: Tối ưu chi phí vận tải: Gộp tuyến và cắt giảm 124 chuyến xe KTC non tải &lt;30% thùng để đưa %TLTĐ vượt mốc 50%.</w:t>
             </w:r>
           </w:p>
           <w:p>

</xml_diff>

<commit_message>
feat(script): bo sung phan tich chuyen sau top AM dong gop tang truong %GTC WoW vao kich ban
</commit_message>
<xml_diff>
--- a/KICH_BAN_THUYET_TRINH_W40_NAM_TRUNG_BO.docx
+++ b/KICH_BAN_THUYET_TRINH_W40_NAM_TRUNG_BO.docx
@@ -1292,22 +1292,22 @@
                 <w:color w:val="1F2937"/>
                 <w:sz w:val="22"/>
               </w:rPr>
-              <w:t>📍 2. XẾP HẠNG %GTC THEO 18 AM:</w:t>
-            </w:r>
-          </w:p>
-          <w:p>
-            <w:pPr>
-              <w:spacing w:before="40" w:after="80" w:line="276" w:lineRule="auto"/>
-            </w:pPr>
-            <w:r>
-              <w:rPr>
-                <w:rFonts w:ascii="Times New Roman" w:hAnsi="Times New Roman"/>
-                <w:b w:val="0"/>
-                <w:i w:val="0"/>
-                <w:color w:val="1F2937"/>
-                <w:sz w:val="22"/>
-              </w:rPr>
-              <w:t>• Top AM xuất sắc (&gt;68%): Nguyễn Ngọc Khánh (74,5% - Top 1 GTC toàn vùng), Thái Thị Thanh Thư (72,0% - Top 2 GTC), Nguyễn Đỗ Minh Nghĩa (70,4%), Nguyễn Duy Long (69,0% - Đầu tàu sản lượng lớn nhất vùng), Cao Thị Thanh Thủy (68,0%).</w:t>
+              <w:t>📍 2. XẾP HẠNG %GTC TUYỆT ĐỐI THEO 18 AM (TOP ĐẦU &amp; ĐÁY BẢNG):</w:t>
+            </w:r>
+          </w:p>
+          <w:p>
+            <w:pPr>
+              <w:spacing w:before="40" w:after="80" w:line="276" w:lineRule="auto"/>
+            </w:pPr>
+            <w:r>
+              <w:rPr>
+                <w:rFonts w:ascii="Times New Roman" w:hAnsi="Times New Roman"/>
+                <w:b w:val="0"/>
+                <w:i w:val="0"/>
+                <w:color w:val="1F2937"/>
+                <w:sz w:val="22"/>
+              </w:rPr>
+              <w:t>• Top AM xuất sắc (&gt;68%): Nguyễn Ngọc Khánh (74,5% - Top 1 GTC toàn vùng), Thái Thị Thanh Thư (72,0% - Top 2 GTC), Nguyễn Đỗ Minh Nghĩa (70,4%), Nguyễn Duy Long (69,0% - Đầu tàu sản lượng 42,7k đơn), Cao Thị Thanh Thủy (68,0%).</w:t>
             </w:r>
           </w:p>
           <w:p>
@@ -1352,6 +1352,141 @@
                 <w:color w:val="1F2937"/>
                 <w:sz w:val="22"/>
               </w:rPr>
+              <w:t>📍 3. TOP AM CÓ ĐÓNG GÓP TĂNG TRƯỞNG %GTC LỚN NHẤT TUẦN VỪA RỒI (Δ WoW W40 vs W39):</w:t>
+            </w:r>
+          </w:p>
+          <w:p>
+            <w:pPr>
+              <w:spacing w:before="40" w:after="80" w:line="276" w:lineRule="auto"/>
+            </w:pPr>
+            <w:r>
+              <w:rPr>
+                <w:rFonts w:ascii="Times New Roman" w:hAnsi="Times New Roman"/>
+                <w:b w:val="0"/>
+                <w:i w:val="0"/>
+                <w:color w:val="1F2937"/>
+                <w:sz w:val="22"/>
+              </w:rPr>
+              <w:t>• 🥇 AM Trương Quang Linh (Đắk Nông): Tăng mạnh nhất vùng +14,49%p (từ 25,85% lên 40,34%) ➔ Bước nhảy vọt thoát khỏi đáy tuyệt đối.</w:t>
+            </w:r>
+          </w:p>
+          <w:p>
+            <w:pPr>
+              <w:spacing w:before="40" w:after="80" w:line="276" w:lineRule="auto"/>
+            </w:pPr>
+            <w:r>
+              <w:rPr>
+                <w:rFonts w:ascii="Times New Roman" w:hAnsi="Times New Roman"/>
+                <w:b w:val="0"/>
+                <w:i w:val="0"/>
+                <w:color w:val="1F2937"/>
+                <w:sz w:val="22"/>
+              </w:rPr>
+              <w:t>• 🥈 AM Lê Văn Trường (Lâm Đồng): Tăng bứt phá +11,85%p (từ 37,10% lên 48,95%) trên tải lớn 37.411 đơn ➔ Công thần chủ lực kéo toàn tỉnh Lâm Đồng tăng vọt +7,05%p!</w:t>
+            </w:r>
+          </w:p>
+          <w:p>
+            <w:pPr>
+              <w:spacing w:before="40" w:after="80" w:line="276" w:lineRule="auto"/>
+            </w:pPr>
+            <w:r>
+              <w:rPr>
+                <w:rFonts w:ascii="Times New Roman" w:hAnsi="Times New Roman"/>
+                <w:b w:val="0"/>
+                <w:i w:val="0"/>
+                <w:color w:val="1F2937"/>
+                <w:sz w:val="22"/>
+              </w:rPr>
+              <w:t>• 🥉 AM Thái Thị Thanh Thư (Khánh Hòa): Tăng thần tốc +9,63%p (từ 62,38% lên 72,02%) trên tải lớn 35.889 đơn ➔ Nhân tố số 1 kéo tỉnh Khánh Hòa bứt phá vượt mốc 60%!</w:t>
+            </w:r>
+          </w:p>
+          <w:p>
+            <w:pPr>
+              <w:spacing w:before="40" w:after="80" w:line="276" w:lineRule="auto"/>
+            </w:pPr>
+            <w:r>
+              <w:rPr>
+                <w:rFonts w:ascii="Times New Roman" w:hAnsi="Times New Roman"/>
+                <w:b w:val="0"/>
+                <w:i w:val="0"/>
+                <w:color w:val="1F2937"/>
+                <w:sz w:val="22"/>
+              </w:rPr>
+              <w:t>• 4️⃣ AM Phan Nguyễn Yến Nhi (Lâm Đồng): Tăng +8,96%p (từ 29,00% lên 37,96%).</w:t>
+            </w:r>
+          </w:p>
+          <w:p>
+            <w:pPr>
+              <w:spacing w:before="40" w:after="80" w:line="276" w:lineRule="auto"/>
+            </w:pPr>
+            <w:r>
+              <w:rPr>
+                <w:rFonts w:ascii="Times New Roman" w:hAnsi="Times New Roman"/>
+                <w:b w:val="0"/>
+                <w:i w:val="0"/>
+                <w:color w:val="1F2937"/>
+                <w:sz w:val="22"/>
+              </w:rPr>
+              <w:t>• 5️⃣ AM Nguyễn Lê Nguyên Vũ (Lâm Đồng): Tăng +7,53%p (từ 41,44% lên 48,97%).</w:t>
+            </w:r>
+          </w:p>
+          <w:p>
+            <w:pPr>
+              <w:spacing w:before="40" w:after="80" w:line="276" w:lineRule="auto"/>
+            </w:pPr>
+            <w:r>
+              <w:rPr>
+                <w:rFonts w:ascii="Times New Roman" w:hAnsi="Times New Roman"/>
+                <w:b w:val="0"/>
+                <w:i w:val="0"/>
+                <w:color w:val="1F2937"/>
+                <w:sz w:val="22"/>
+              </w:rPr>
+              <w:t>• 6️⃣ AM Lê Minh Lợi (Lâm Đồng): Tăng +5,89%p (từ 30,61% lên 36,50%).</w:t>
+            </w:r>
+          </w:p>
+          <w:p>
+            <w:pPr>
+              <w:spacing w:before="40" w:after="80" w:line="276" w:lineRule="auto"/>
+            </w:pPr>
+            <w:r>
+              <w:rPr>
+                <w:rFonts w:ascii="Times New Roman" w:hAnsi="Times New Roman"/>
+                <w:b w:val="0"/>
+                <w:i w:val="0"/>
+                <w:color w:val="1F2937"/>
+                <w:sz w:val="22"/>
+              </w:rPr>
+              <w:t>• 7️⃣ AM Hồng Bích Nga (Lâm Đồng/Đắk Nông): Tăng +3,53%p (từ 55,87% lên 59,40%).</w:t>
+            </w:r>
+          </w:p>
+          <w:p>
+            <w:pPr>
+              <w:spacing w:before="40" w:after="80" w:line="276" w:lineRule="auto"/>
+            </w:pPr>
+            <w:r>
+              <w:rPr>
+                <w:rFonts w:ascii="Times New Roman" w:hAnsi="Times New Roman"/>
+                <w:b w:val="0"/>
+                <w:i w:val="0"/>
+                <w:color w:val="1F2937"/>
+                <w:sz w:val="22"/>
+              </w:rPr>
+              <w:t>• 8️⃣ AM Trần Thị Nhung (Đắk Nông): Tăng +3,49%p (từ 55,46% lên 58,95% với 37.073 đơn).</w:t>
+            </w:r>
+          </w:p>
+          <w:p>
+            <w:pPr>
+              <w:spacing w:before="40" w:after="80" w:line="276" w:lineRule="auto"/>
+            </w:pPr>
+            <w:r>
+              <w:rPr>
+                <w:rFonts w:ascii="Times New Roman" w:hAnsi="Times New Roman"/>
+                <w:b w:val="0"/>
+                <w:i w:val="0"/>
+                <w:color w:val="1F2937"/>
+                <w:sz w:val="22"/>
+              </w:rPr>
               <w:t>🎙️ LỜI THOẠI THUYẾT TRÌNH TỰ NHIÊN (KHI BẬT TAB 3 GTC TỔNG):</w:t>
             </w:r>
           </w:p>
@@ -1427,52 +1562,97 @@
                 <w:color w:val="1F2937"/>
                 <w:sz w:val="22"/>
               </w:rPr>
-              <w:t>Hai tỉnh miền núi là Đắk Nông và Lâm Đồng: Dù vẫn đứng ở 2 vị trí cuối bảng với 54,4%, nhưng tuần này anh em đã có sự nỗ lực phi thường. Lâm Đồng kéo tăng tới hơn +7,0%p, còn Đắk Nông tăng hơn +5,6%p so với tuần trước. Em xin ghi nhận sự quyết tâm của các AM Tây Nguyên!</w:t>
-            </w:r>
-          </w:p>
-          <w:p>
-            <w:pPr>
-              <w:spacing w:before="40" w:after="80" w:line="276" w:lineRule="auto"/>
-            </w:pPr>
-            <w:r>
-              <w:rPr>
-                <w:rFonts w:ascii="Times New Roman" w:hAnsi="Times New Roman"/>
-                <w:b w:val="0"/>
-                <w:i w:val="0"/>
-                <w:color w:val="1F2937"/>
-                <w:sz w:val="22"/>
-              </w:rPr>
-              <w:t>Nhìn xuống bảng xếp hạng 18 AM:</w:t>
-            </w:r>
-          </w:p>
-          <w:p>
-            <w:pPr>
-              <w:spacing w:before="40" w:after="80" w:line="276" w:lineRule="auto"/>
-            </w:pPr>
-            <w:r>
-              <w:rPr>
-                <w:rFonts w:ascii="Times New Roman" w:hAnsi="Times New Roman"/>
-                <w:b w:val="0"/>
-                <w:i w:val="0"/>
-                <w:color w:val="1F2937"/>
-                <w:sz w:val="22"/>
-              </w:rPr>
-              <w:t>Quán quân GTC tuần này thuộc về anh Nguyễn Ngọc Khánh (Bình Thuận) với tỷ lệ ấn tượng 74,5%, kế đến là chị Thái Thị Thanh Thư (Khánh Hòa) đạt 72,0% và anh Nguyễn Đỗ Minh Nghĩa (Lâm Đồng) đạt 70,4%.</w:t>
-            </w:r>
-          </w:p>
-          <w:p>
-            <w:pPr>
-              <w:spacing w:before="40" w:after="80" w:line="276" w:lineRule="auto"/>
-            </w:pPr>
-            <w:r>
-              <w:rPr>
-                <w:rFonts w:ascii="Times New Roman" w:hAnsi="Times New Roman"/>
-                <w:b w:val="0"/>
-                <w:i w:val="0"/>
-                <w:color w:val="1F2937"/>
-                <w:sz w:val="22"/>
-              </w:rPr>
-              <w:t>Đặc biệt, anh Nguyễn Duy Long (phụ trách liên tỉnh Ninh Thuận &amp; Bắc Bình Thuận) tiếp tục là đầu tàu gánh sản lượng lớn nhất toàn vùng với 42.684 đơn Full hàng, nhưng vẫn duy trì %GTC rất vững vàng ở mức 69,0%!</w:t>
+              <w:t>Hai tỉnh miền núi là Đắk Nông và Lâm Đồng: Dù vẫn đứng ở 2 vị trí cuối bảng với 54,4%, nhưng tuần này anh em đã có sự nỗ lực phi thường. Lâm Đồng kéo tăng tới hơn +7,0%p, còn Đắk Nông tăng hơn +5,6%p so với tuần trước.</w:t>
+            </w:r>
+          </w:p>
+          <w:p>
+            <w:pPr>
+              <w:spacing w:before="40" w:after="80" w:line="276" w:lineRule="auto"/>
+            </w:pPr>
+            <w:r>
+              <w:rPr>
+                <w:rFonts w:ascii="Times New Roman" w:hAnsi="Times New Roman"/>
+                <w:b w:val="0"/>
+                <w:i w:val="0"/>
+                <w:color w:val="1F2937"/>
+                <w:sz w:val="22"/>
+              </w:rPr>
+              <w:t>Đặc biệt, khi mổ xẻ đóng góp của 18 AM, Ban Giám Đốc sẽ thấy một điểm mấu chốt rất đáng biểu dương:</w:t>
+            </w:r>
+          </w:p>
+          <w:p>
+            <w:pPr>
+              <w:spacing w:before="40" w:after="80" w:line="276" w:lineRule="auto"/>
+            </w:pPr>
+            <w:r>
+              <w:rPr>
+                <w:rFonts w:ascii="Times New Roman" w:hAnsi="Times New Roman"/>
+                <w:b w:val="0"/>
+                <w:i w:val="0"/>
+                <w:color w:val="1F2937"/>
+                <w:sz w:val="22"/>
+              </w:rPr>
+              <w:t>Tuần này toàn vùng tăng mạnh +4,19%p KHÔNG PHẢI nhờ nhóm ven biển (vì Bình Thuận và Ninh Thuận đã ở mức trần nên đi ngang ~67,5%), mà công lớn nhất kéo cả vùng bứt phá tuần này thuộc về 3 AM có bước nhảy vọt thần tốc:</w:t>
+            </w:r>
+          </w:p>
+          <w:p>
+            <w:pPr>
+              <w:spacing w:before="40" w:after="80" w:line="276" w:lineRule="auto"/>
+            </w:pPr>
+            <w:r>
+              <w:rPr>
+                <w:rFonts w:ascii="Times New Roman" w:hAnsi="Times New Roman"/>
+                <w:b w:val="0"/>
+                <w:i w:val="0"/>
+                <w:color w:val="1F2937"/>
+                <w:sz w:val="22"/>
+              </w:rPr>
+              <w:t>Thứ nhất là chị Thái Thị Thanh Thư ở Khánh Hòa: Tăng vọt tới gần +10%p (từ 62,4% lên 72,0%) trên khối lượng gần 36 ngàn đơn, đưa chị Thư lên thẳng vị trí Á quân GTC toàn vùng và kéo bừng sáng cả tỉnh Khánh Hòa!</w:t>
+            </w:r>
+          </w:p>
+          <w:p>
+            <w:pPr>
+              <w:spacing w:before="40" w:after="80" w:line="276" w:lineRule="auto"/>
+            </w:pPr>
+            <w:r>
+              <w:rPr>
+                <w:rFonts w:ascii="Times New Roman" w:hAnsi="Times New Roman"/>
+                <w:b w:val="0"/>
+                <w:i w:val="0"/>
+                <w:color w:val="1F2937"/>
+                <w:sz w:val="22"/>
+              </w:rPr>
+              <w:t>Thứ hai là anh Lê Văn Trường ở Lâm Đồng: Tăng phi thường +11,9%p (từ 37,1% lên 49,0%) trên khối lượng cực lớn hơn 37 ngàn đơn! Chính anh Trường là đầu tàu kéo Lâm Đồng tăng hơn 7%p tuần này!</w:t>
+            </w:r>
+          </w:p>
+          <w:p>
+            <w:pPr>
+              <w:spacing w:before="40" w:after="80" w:line="276" w:lineRule="auto"/>
+            </w:pPr>
+            <w:r>
+              <w:rPr>
+                <w:rFonts w:ascii="Times New Roman" w:hAnsi="Times New Roman"/>
+                <w:b w:val="0"/>
+                <w:i w:val="0"/>
+                <w:color w:val="1F2937"/>
+                <w:sz w:val="22"/>
+              </w:rPr>
+              <w:t>Thứ ba là anh Trương Quang Linh ở Đắk Nông: Tăng bứt phá mạnh nhất toàn vùng với +14,5%p (từ 25,8% lên 40,3%). Bên cạnh đó, anh Vũ (+7,5%p), chị Nhi (+9,0%p) và chị Nhung (+3,5%p trên 37 ngàn đơn) cũng là những nhân tố nòng cốt kéo toàn bộ khu vực Tây Nguyên thoát đáy!</w:t>
+            </w:r>
+          </w:p>
+          <w:p>
+            <w:pPr>
+              <w:spacing w:before="40" w:after="80" w:line="276" w:lineRule="auto"/>
+            </w:pPr>
+            <w:r>
+              <w:rPr>
+                <w:rFonts w:ascii="Times New Roman" w:hAnsi="Times New Roman"/>
+                <w:b w:val="0"/>
+                <w:i w:val="0"/>
+                <w:color w:val="1F2937"/>
+                <w:sz w:val="22"/>
+              </w:rPr>
+              <w:t>Bên cạnh các AM tăng trưởng mạnh, em cũng xin ghi nhận anh Nguyễn Ngọc Khánh (Bình Thuận) giữ vững ngôi Quán quân GTC toàn vùng với 74,5%, và anh Nguyễn Duy Long tiếp tục là đầu tàu gánh sản lượng lớn nhất toàn vùng (gần 43 ngàn đơn Full hàng) với GTC rất vững 69,0%.</w:t>
             </w:r>
           </w:p>
           <w:p>
@@ -1502,22 +1682,22 @@
                 <w:color w:val="1F2937"/>
                 <w:sz w:val="22"/>
               </w:rPr>
-              <w:t>Đặc biệt là anh Lê Minh Lợi (36,5%), chị Yến Nhi (38,0%) và anh Trương Quang Linh (40,3%): Các địa bàn này tỷ lệ khách từ chối và hẹn lùi giờ còn cao, shipper chưa linh hoạt đổi ca phát.</w:t>
-            </w:r>
-          </w:p>
-          <w:p>
-            <w:pPr>
-              <w:spacing w:before="40" w:after="80" w:line="276" w:lineRule="auto"/>
-            </w:pPr>
-            <w:r>
-              <w:rPr>
-                <w:rFonts w:ascii="Times New Roman" w:hAnsi="Times New Roman"/>
-                <w:b w:val="0"/>
-                <w:i w:val="0"/>
-                <w:color w:val="1F2937"/>
-                <w:sz w:val="22"/>
-              </w:rPr>
-              <w:t>Em đề nghị tuần tới, các AM nhóm dưới phải ngồi lại với từng Trưởng bưu cục để tối ưu lại ca phát chiều. Giờ em xin chuyển qua Tab 4 mổ xẻ Ca 1 và Ca 2 ạ!"</w:t>
+              <w:t>Dù anh Lợi (+5,9%p), chị Nhi (+9,0%p) và anh Linh (+14,5%p) đã có tiến bộ vượt bậc, nhưng GTC tuyệt đối vẫn còn dưới 40%, shipper vẫn chưa linh hoạt đổi ca phát chiều tối.</w:t>
+            </w:r>
+          </w:p>
+          <w:p>
+            <w:pPr>
+              <w:spacing w:before="40" w:after="80" w:line="276" w:lineRule="auto"/>
+            </w:pPr>
+            <w:r>
+              <w:rPr>
+                <w:rFonts w:ascii="Times New Roman" w:hAnsi="Times New Roman"/>
+                <w:b w:val="0"/>
+                <w:i w:val="0"/>
+                <w:color w:val="1F2937"/>
+                <w:sz w:val="22"/>
+              </w:rPr>
+              <w:t>Em đề nghị tuần tới, các AM nhóm dưới phải duy trì đà tiến bộ này và ngồi lại với từng Trưởng bưu cục để tối ưu lại ca phát chiều. Giờ em xin chuyển qua Tab 4 mổ xẻ Ca 1 và Ca 2 ạ!"</w:t>
             </w:r>
           </w:p>
           <w:p>
@@ -1549,7 +1729,7 @@
                 <w:color w:val="1F2937"/>
                 <w:sz w:val="21"/>
               </w:rPr>
-              <w:t>• Lâm Đồng (+7,05%p) và Đắk Nông (+5,65%p) chứng minh việc tập trung đôn đốc shipper có thể tạo ra bước nhảy vọt về GTC ngay trong 1 tuần.</w:t>
+              <w:t>• Động lực tăng trưởng GTC tuần W40 (+4,19%p toàn vùng) chủ yếu đến từ sự bứt phá của AM Lê Văn Trường (+11,85%p / 37,4k đơn) và AM Thái Thị Thanh Thư (+9,63%p / 35,9k đơn).</w:t>
             </w:r>
           </w:p>
           <w:p>
@@ -1597,7 +1777,7 @@
                 <w:color w:val="991B1B"/>
                 <w:sz w:val="21"/>
               </w:rPr>
-              <w:t>• 6 AM (Lợi, Nhi, Linh, Duân, Trường, Vũ) vẫn chìm dưới 50% GTC, kéo tụt mặt bằng chung và làm tăng tỷ lệ hàng dồn tồn kho.</w:t>
+              <w:t>• 6 AM (Lợi, Nhi, Linh, Duân, Trường, Vũ) dù đã có cải thiện mạnh về biến động nhưng mức tuyệt đối vẫn dưới 50% GTC, cần duy trì kỷ luật đôn đốc.</w:t>
             </w:r>
           </w:p>
           <w:p>

</xml_diff>

<commit_message>
feat(script): them phan tich chuyen sau GTC TikTok Shop (TTS) theo 5 tinh va 18 AM
</commit_message>
<xml_diff>
--- a/KICH_BAN_THUYET_TRINH_W40_NAM_TRUNG_BO.docx
+++ b/KICH_BAN_THUYET_TRINH_W40_NAM_TRUNG_BO.docx
@@ -1487,6 +1487,81 @@
                 <w:color w:val="1F2937"/>
                 <w:sz w:val="22"/>
               </w:rPr>
+              <w:t>📍 4. BÓC TÁCH RIÊNG PHÂN KHÚC %GTC TIKTOK SHOP (TTS) — ĐỘNG LỰC BỨT PHÁ 63,38% (+5,84%p WoW):</w:t>
+            </w:r>
+          </w:p>
+          <w:p>
+            <w:pPr>
+              <w:spacing w:before="40" w:after="80" w:line="276" w:lineRule="auto"/>
+            </w:pPr>
+            <w:r>
+              <w:rPr>
+                <w:rFonts w:ascii="Times New Roman" w:hAnsi="Times New Roman"/>
+                <w:b w:val="0"/>
+                <w:i w:val="0"/>
+                <w:color w:val="1F2937"/>
+                <w:sz w:val="22"/>
+              </w:rPr>
+              <w:t>• Toàn vùng TTS: Đạt đỉnh 63,38% (tăng vọt +5,84%p WoW so với W39: 57,54%), cao hơn Full hàng chung 2,51%p (60,87%).</w:t>
+            </w:r>
+          </w:p>
+          <w:p>
+            <w:pPr>
+              <w:spacing w:before="40" w:after="80" w:line="276" w:lineRule="auto"/>
+            </w:pPr>
+            <w:r>
+              <w:rPr>
+                <w:rFonts w:ascii="Times New Roman" w:hAnsi="Times New Roman"/>
+                <w:b w:val="0"/>
+                <w:i w:val="0"/>
+                <w:color w:val="1F2937"/>
+                <w:sz w:val="22"/>
+              </w:rPr>
+              <w:t>• Theo 5 Tỉnh thành TTS: Lâm Đồng tăng số 1 vùng +10,36%p (từ 48,73% lên 59,09% với 24.505 đơn TTS); Đắk Nông tăng +6,32%p (từ 49,57% lên 55,88%); Khánh Hòa tăng +3,85%p (từ 59,89% lên 63,74%); Ninh Thuận (67,94%) và Bình Thuận (67,78%) tiếp tục giữ đỉnh.</w:t>
+            </w:r>
+          </w:p>
+          <w:p>
+            <w:pPr>
+              <w:spacing w:before="40" w:after="80" w:line="276" w:lineRule="auto"/>
+            </w:pPr>
+            <w:r>
+              <w:rPr>
+                <w:rFonts w:ascii="Times New Roman" w:hAnsi="Times New Roman"/>
+                <w:b w:val="0"/>
+                <w:i w:val="0"/>
+                <w:color w:val="1F2937"/>
+                <w:sz w:val="22"/>
+              </w:rPr>
+              <w:t>• Top AM tăng trưởng GTC TTS mạnh nhất (Δ WoW): 🥇 AM Nguyễn Thanh Long (+14,84%p, từ 46,1% lên 61,0%), 🥈 AM Lê Minh Lợi (+14,57%p), 🥉 AM Lê Văn Trường (+11,41%p, từ 39,9% lên 51,3%), 4️⃣ AM Nguyễn Lê Nguyên Vũ (+9,41%p, từ 41,5% lên 51,0%), 5️⃣ AM Hồng Bích Nga (+5,58%p, từ 55,1% lên 60,7%).</w:t>
+            </w:r>
+          </w:p>
+          <w:p>
+            <w:pPr>
+              <w:spacing w:before="40" w:after="80" w:line="276" w:lineRule="auto"/>
+            </w:pPr>
+            <w:r>
+              <w:rPr>
+                <w:rFonts w:ascii="Times New Roman" w:hAnsi="Times New Roman"/>
+                <w:b w:val="0"/>
+                <w:i w:val="0"/>
+                <w:color w:val="1F2937"/>
+                <w:sz w:val="22"/>
+              </w:rPr>
+              <w:t>• Top AM đạt %GTC TTS cao nhất vùng: 🥇 Nguyễn Ngọc Khánh (75,56%), 🥈 Nguyễn Đỗ Minh Nghĩa (70,77%), 🥉 Nguyễn Duy Long (69,42% — Gánh sản lượng TTS lớn nhất vùng: 18.628 đơn), 4️⃣ Cao Thị Thanh Thủy (69,30%), 5️⃣ Nguyễn Thị Tuyết Thơ (68,73%).</w:t>
+            </w:r>
+          </w:p>
+          <w:p>
+            <w:pPr>
+              <w:spacing w:before="40" w:after="80" w:line="276" w:lineRule="auto"/>
+            </w:pPr>
+            <w:r>
+              <w:rPr>
+                <w:rFonts w:ascii="Times New Roman" w:hAnsi="Times New Roman"/>
+                <w:b w:val="0"/>
+                <w:i w:val="0"/>
+                <w:color w:val="1F2937"/>
+                <w:sz w:val="22"/>
+              </w:rPr>
               <w:t>🎙️ LỜI THOẠI THUYẾT TRÌNH TỰ NHIÊN (KHI BẬT TAB 3 GTC TỔNG):</w:t>
             </w:r>
           </w:p>
@@ -1652,22 +1727,67 @@
                 <w:color w:val="1F2937"/>
                 <w:sz w:val="22"/>
               </w:rPr>
-              <w:t>Bên cạnh các AM tăng trưởng mạnh, em cũng xin ghi nhận anh Nguyễn Ngọc Khánh (Bình Thuận) giữ vững ngôi Quán quân GTC toàn vùng với 74,5%, và anh Nguyễn Duy Long tiếp tục là đầu tàu gánh sản lượng lớn nhất toàn vùng (gần 43 ngàn đơn Full hàng) với GTC rất vững 69,0%.</w:t>
-            </w:r>
-          </w:p>
-          <w:p>
-            <w:pPr>
-              <w:spacing w:before="40" w:after="80" w:line="276" w:lineRule="auto"/>
-            </w:pPr>
-            <w:r>
-              <w:rPr>
-                <w:rFonts w:ascii="Times New Roman" w:hAnsi="Times New Roman"/>
-                <w:b w:val="0"/>
-                <w:i w:val="0"/>
-                <w:color w:val="1F2937"/>
-                <w:sz w:val="22"/>
-              </w:rPr>
-              <w:t>Tuy nhiên, Ban Giám Đốc lưu ý giúp em nhóm các AM vẫn còn nằm dưới mốc 50%:</w:t>
+              <w:t>Đặc biệt khi nhìn sang kênh TikTok Shop (TTS):</w:t>
+            </w:r>
+          </w:p>
+          <w:p>
+            <w:pPr>
+              <w:spacing w:before="40" w:after="80" w:line="276" w:lineRule="auto"/>
+            </w:pPr>
+            <w:r>
+              <w:rPr>
+                <w:rFonts w:ascii="Times New Roman" w:hAnsi="Times New Roman"/>
+                <w:b w:val="0"/>
+                <w:i w:val="0"/>
+                <w:color w:val="1F2937"/>
+                <w:sz w:val="22"/>
+              </w:rPr>
+              <w:t>Hiệu suất giao sàn TMĐT tuần này bùng nổ vượt bậc khi đạt kỷ lục 63,38% (tăng vọt tới +5,84%p WoW), cao hơn mặt bằng chung 2,51%p!</w:t>
+            </w:r>
+          </w:p>
+          <w:p>
+            <w:pPr>
+              <w:spacing w:before="40" w:after="80" w:line="276" w:lineRule="auto"/>
+            </w:pPr>
+            <w:r>
+              <w:rPr>
+                <w:rFonts w:ascii="Times New Roman" w:hAnsi="Times New Roman"/>
+                <w:b w:val="0"/>
+                <w:i w:val="0"/>
+                <w:color w:val="1F2937"/>
+                <w:sz w:val="22"/>
+              </w:rPr>
+              <w:t>Trong đó, anh Nguyễn Thanh Long ở Cam Ranh tăng trưởng kỷ lục +14,84%p GTC TTS, anh Lê Văn Trường kéo GTC TTS Lâm Đồng tăng tới hơn +10,3%p, và anh Nguyễn Duy Long tiếp tục là 'lá chắn thép' khi gánh tới gần 19 ngàn đơn TikTok Shop mà vẫn duy trì GTC TTS chuẩn đét ở mức 69,42%!</w:t>
+            </w:r>
+          </w:p>
+          <w:p>
+            <w:pPr>
+              <w:spacing w:before="40" w:after="80" w:line="276" w:lineRule="auto"/>
+            </w:pPr>
+            <w:r>
+              <w:rPr>
+                <w:rFonts w:ascii="Times New Roman" w:hAnsi="Times New Roman"/>
+                <w:b w:val="0"/>
+                <w:i w:val="0"/>
+                <w:color w:val="1F2937"/>
+                <w:sz w:val="22"/>
+              </w:rPr>
+              <w:t>Quán quân GTC TikTok Shop tuần này thuộc về anh Nguyễn Ngọc Khánh (75,56%) và anh Nguyễn Đỗ Minh Nghĩa (70,77%).</w:t>
+            </w:r>
+          </w:p>
+          <w:p>
+            <w:pPr>
+              <w:spacing w:before="40" w:after="80" w:line="276" w:lineRule="auto"/>
+            </w:pPr>
+            <w:r>
+              <w:rPr>
+                <w:rFonts w:ascii="Times New Roman" w:hAnsi="Times New Roman"/>
+                <w:b w:val="0"/>
+                <w:i w:val="0"/>
+                <w:color w:val="1F2937"/>
+                <w:sz w:val="22"/>
+              </w:rPr>
+              <w:t>Tuy nhiên, Ban Giám Đốc lưu ý giúp em nhóm các AM vẫn còn nằm dưới mốc 50% GTC:</w:t>
             </w:r>
           </w:p>
           <w:p>
@@ -1745,7 +1865,7 @@
                 <w:color w:val="1F2937"/>
                 <w:sz w:val="21"/>
               </w:rPr>
-              <w:t>• Kênh TikTok Shop đạt 63,38% GTC, cao hơn Full hàng 2,51%p, cho thấy đơn sàn TMĐT có độ hoàn tất nhanh hơn đơn hàng ngoài.</w:t>
+              <w:t>• Kênh TikTok Shop đạt đỉnh 63,38% GTC (tăng +5,84%p WoW), trong đó Lâm Đồng bứt phá +10,36%p và Đắk Nông tăng +6,32%p.</w:t>
             </w:r>
           </w:p>
           <w:p>

</xml_diff>

<commit_message>
fix(script): chuan hoa 100% so lieu GTC Ca 1 TTS thuan (81,34%) va Ca 1 Tong (66,47%) theo dung Excel W40
</commit_message>
<xml_diff>
--- a/KICH_BAN_THUYET_TRINH_W40_NAM_TRUNG_BO.docx
+++ b/KICH_BAN_THUYET_TRINH_W40_NAM_TRUNG_BO.docx
@@ -2012,157 +2012,202 @@
                 <w:color w:val="EA580C"/>
                 <w:sz w:val="23"/>
               </w:rPr>
-              <w:t>🗣️ MỔ XẺ GIAO HÀNG CA 1 SÁNG: HÀNG TỒN (52.8%) VS HÀNG THUẦN (72.4%):</w:t>
-            </w:r>
-          </w:p>
-          <w:p>
-            <w:pPr>
-              <w:spacing w:before="40" w:after="80" w:line="276" w:lineRule="auto"/>
-            </w:pPr>
-            <w:r>
-              <w:rPr>
-                <w:rFonts w:ascii="Times New Roman" w:hAnsi="Times New Roman"/>
-                <w:b w:val="0"/>
-                <w:i w:val="0"/>
-                <w:color w:val="1F2937"/>
-                <w:sz w:val="22"/>
-              </w:rPr>
-              <w:t>📍 1. BẢNG HIỆU SUẤT GIAO CA 1 THEO 5 TỈNH THÀNH (W40):</w:t>
-            </w:r>
-          </w:p>
-          <w:p>
-            <w:pPr>
-              <w:spacing w:before="40" w:after="80" w:line="276" w:lineRule="auto"/>
-            </w:pPr>
-            <w:r>
-              <w:rPr>
-                <w:rFonts w:ascii="Times New Roman" w:hAnsi="Times New Roman"/>
-                <w:b w:val="0"/>
-                <w:i w:val="0"/>
-                <w:color w:val="1F2937"/>
-                <w:sz w:val="22"/>
-              </w:rPr>
-              <w:t>• Toàn vùng: GTC Ca 1 Hàng Tồn đạt 52,80% (tăng +3,8%p) | GTC Ca 1 Hàng Thuần đạt 72,40% (tăng +3,1%p; TTS đạt đỉnh 75,80%).</w:t>
-            </w:r>
-          </w:p>
-          <w:p>
-            <w:pPr>
-              <w:spacing w:before="40" w:after="80" w:line="276" w:lineRule="auto"/>
-            </w:pPr>
-            <w:r>
-              <w:rPr>
-                <w:rFonts w:ascii="Times New Roman" w:hAnsi="Times New Roman"/>
-                <w:b w:val="0"/>
-                <w:i w:val="0"/>
-                <w:color w:val="1F2937"/>
-                <w:sz w:val="22"/>
-              </w:rPr>
-              <w:t>• Bình Thuận: Hàng Tồn 58,4% | Hàng Thuần 76,2% ➔ Đạt chuẩn SLA toàn diện.</w:t>
-            </w:r>
-          </w:p>
-          <w:p>
-            <w:pPr>
-              <w:spacing w:before="40" w:after="80" w:line="276" w:lineRule="auto"/>
-            </w:pPr>
-            <w:r>
-              <w:rPr>
-                <w:rFonts w:ascii="Times New Roman" w:hAnsi="Times New Roman"/>
-                <w:b w:val="0"/>
-                <w:i w:val="0"/>
-                <w:color w:val="1F2937"/>
-                <w:sz w:val="22"/>
-              </w:rPr>
-              <w:t>• Khánh Hòa: Hàng Tồn 56,1% | Hàng Thuần 74,5% ➔ Xử lý hàng tồn đầu ngày rất sạch.</w:t>
-            </w:r>
-          </w:p>
-          <w:p>
-            <w:pPr>
-              <w:spacing w:before="40" w:after="80" w:line="276" w:lineRule="auto"/>
-            </w:pPr>
-            <w:r>
-              <w:rPr>
-                <w:rFonts w:ascii="Times New Roman" w:hAnsi="Times New Roman"/>
-                <w:b w:val="0"/>
-                <w:i w:val="0"/>
-                <w:color w:val="1F2937"/>
-                <w:sz w:val="22"/>
-              </w:rPr>
-              <w:t>• Ninh Thuận: Hàng Tồn 53,2% | Hàng Thuần 71,8%.</w:t>
-            </w:r>
-          </w:p>
-          <w:p>
-            <w:pPr>
-              <w:spacing w:before="40" w:after="80" w:line="276" w:lineRule="auto"/>
-            </w:pPr>
-            <w:r>
-              <w:rPr>
-                <w:rFonts w:ascii="Times New Roman" w:hAnsi="Times New Roman"/>
-                <w:b w:val="0"/>
-                <w:i w:val="0"/>
-                <w:color w:val="1F2937"/>
-                <w:sz w:val="22"/>
-              </w:rPr>
-              <w:t>• Đắk Nông: Hàng Tồn 49,5% | Hàng Thuần 68,9% ➔ Hàng tồn đã kéo lên sát 50%.</w:t>
-            </w:r>
-          </w:p>
-          <w:p>
-            <w:pPr>
-              <w:spacing w:before="40" w:after="80" w:line="276" w:lineRule="auto"/>
-            </w:pPr>
-            <w:r>
-              <w:rPr>
-                <w:rFonts w:ascii="Times New Roman" w:hAnsi="Times New Roman"/>
-                <w:b w:val="0"/>
-                <w:i w:val="0"/>
-                <w:color w:val="1F2937"/>
-                <w:sz w:val="22"/>
-              </w:rPr>
-              <w:t>• Lâm Đồng: Hàng Tồn 48,2% | Hàng Thuần 67,5% ➔ Nút thắt lớn nhất nằm ở đơn tồn dồn toa.</w:t>
-            </w:r>
-          </w:p>
-          <w:p>
-            <w:pPr>
-              <w:spacing w:before="40" w:after="80" w:line="276" w:lineRule="auto"/>
-            </w:pPr>
-            <w:r>
-              <w:rPr>
-                <w:rFonts w:ascii="Times New Roman" w:hAnsi="Times New Roman"/>
-                <w:b w:val="0"/>
-                <w:i w:val="0"/>
-                <w:color w:val="1F2937"/>
-                <w:sz w:val="22"/>
-              </w:rPr>
-              <w:t>📍 2. BÓC TÁCH NGUYÊN NHÂN LỆCH PHA:</w:t>
-            </w:r>
-          </w:p>
-          <w:p>
-            <w:pPr>
-              <w:spacing w:before="40" w:after="80" w:line="276" w:lineRule="auto"/>
-            </w:pPr>
-            <w:r>
-              <w:rPr>
-                <w:rFonts w:ascii="Times New Roman" w:hAnsi="Times New Roman"/>
-                <w:b w:val="0"/>
-                <w:i w:val="0"/>
-                <w:color w:val="1F2937"/>
-                <w:sz w:val="22"/>
-              </w:rPr>
-              <w:t>• Hàng Thuần Ca 1 (hàng mới về trong đêm) được shipper ưu tiên chọn giao trước nên đạt tỷ lệ thành công rất cao (72,4%, riêng TTS đạt gần 76%).</w:t>
-            </w:r>
-          </w:p>
-          <w:p>
-            <w:pPr>
-              <w:spacing w:before="40" w:after="80" w:line="276" w:lineRule="auto"/>
-            </w:pPr>
-            <w:r>
-              <w:rPr>
-                <w:rFonts w:ascii="Times New Roman" w:hAnsi="Times New Roman"/>
-                <w:b w:val="0"/>
-                <w:i w:val="0"/>
-                <w:color w:val="1F2937"/>
-                <w:sz w:val="22"/>
-              </w:rPr>
-              <w:t>• Hàng Tồn Ca 1 (hàng của ngày hôm trước trôi sang) chỉ đạt 52,8%: Shipper có tâm lý ngại cầm hàng cũ đi phát vì sợ khách đổi ý không lấy hoặc địa chỉ khó tìm.</w:t>
+              <w:t>🗣️ MỔ XẺ GIAO HÀNG CA 1 SÁNG: HÀNG TỒN (63,6%) VS HÀNG THUẦN (77,3%) — TIKTOK SHOP BỨT PHÁ 81,3%:</w:t>
+            </w:r>
+          </w:p>
+          <w:p>
+            <w:pPr>
+              <w:spacing w:before="40" w:after="80" w:line="276" w:lineRule="auto"/>
+            </w:pPr>
+            <w:r>
+              <w:rPr>
+                <w:rFonts w:ascii="Times New Roman" w:hAnsi="Times New Roman"/>
+                <w:b w:val="0"/>
+                <w:i w:val="0"/>
+                <w:color w:val="1F2937"/>
+                <w:sz w:val="22"/>
+              </w:rPr>
+              <w:t>📍 1. BẢNG HIỆU SUẤT GIAO CA 1 TOÀN VÙNG (W40 vs W39):</w:t>
+            </w:r>
+          </w:p>
+          <w:p>
+            <w:pPr>
+              <w:spacing w:before="40" w:after="80" w:line="276" w:lineRule="auto"/>
+            </w:pPr>
+            <w:r>
+              <w:rPr>
+                <w:rFonts w:ascii="Times New Roman" w:hAnsi="Times New Roman"/>
+                <w:b w:val="0"/>
+                <w:i w:val="0"/>
+                <w:color w:val="1F2937"/>
+                <w:sz w:val="22"/>
+              </w:rPr>
+              <w:t>• Hàng Thuần Ca 1 (Hàng mới sáng sớm): Full hàng đạt 77,35% (tăng +4,38%p WoW); đặc biệt kênh TikTok Shop (TTS) bứt phá ngoạn mục lên 81,34% (tăng +6,17%p WoW so với W39: 75,16%) — chính thức vượt chuẩn xuất sắc ≥80%!</w:t>
+            </w:r>
+          </w:p>
+          <w:p>
+            <w:pPr>
+              <w:spacing w:before="40" w:after="80" w:line="276" w:lineRule="auto"/>
+            </w:pPr>
+            <w:r>
+              <w:rPr>
+                <w:rFonts w:ascii="Times New Roman" w:hAnsi="Times New Roman"/>
+                <w:b w:val="0"/>
+                <w:i w:val="0"/>
+                <w:color w:val="1F2937"/>
+                <w:sz w:val="22"/>
+              </w:rPr>
+              <w:t>• Hàng Tồn + Ca 1 Tổng (Bao gồm đơn tồn cũ): Full hàng đạt 63,56% (+4,87%p); kênh TikTok Shop đạt 66,47% (+6,58%p).</w:t>
+            </w:r>
+          </w:p>
+          <w:p>
+            <w:pPr>
+              <w:spacing w:before="40" w:after="80" w:line="276" w:lineRule="auto"/>
+            </w:pPr>
+            <w:r>
+              <w:rPr>
+                <w:rFonts w:ascii="Times New Roman" w:hAnsi="Times New Roman"/>
+                <w:b w:val="0"/>
+                <w:i w:val="0"/>
+                <w:color w:val="1F2937"/>
+                <w:sz w:val="22"/>
+              </w:rPr>
+              <w:t>📍 2. HIỆU SUẤT GIAO CA 1 HÀNG THUẦN TIKTOK SHOP (TTS) THEO 5 TỈNH THÀNH:</w:t>
+            </w:r>
+          </w:p>
+          <w:p>
+            <w:pPr>
+              <w:spacing w:before="40" w:after="80" w:line="276" w:lineRule="auto"/>
+            </w:pPr>
+            <w:r>
+              <w:rPr>
+                <w:rFonts w:ascii="Times New Roman" w:hAnsi="Times New Roman"/>
+                <w:b w:val="0"/>
+                <w:i w:val="0"/>
+                <w:color w:val="1F2937"/>
+                <w:sz w:val="22"/>
+              </w:rPr>
+              <w:t>• Bình Thuận: 86,45% (W39: 84,64%, +1,81%p) ➔ Dẫn đầu toàn vùng về hiệu suất phát sàn sáng.</w:t>
+            </w:r>
+          </w:p>
+          <w:p>
+            <w:pPr>
+              <w:spacing w:before="40" w:after="80" w:line="276" w:lineRule="auto"/>
+            </w:pPr>
+            <w:r>
+              <w:rPr>
+                <w:rFonts w:ascii="Times New Roman" w:hAnsi="Times New Roman"/>
+                <w:b w:val="0"/>
+                <w:i w:val="0"/>
+                <w:color w:val="1F2937"/>
+                <w:sz w:val="22"/>
+              </w:rPr>
+              <w:t>• Ninh Thuận: 83,78% (W39: 84,75%) ➔ Duy trì vị trí số 2 xuất sắc.</w:t>
+            </w:r>
+          </w:p>
+          <w:p>
+            <w:pPr>
+              <w:spacing w:before="40" w:after="80" w:line="276" w:lineRule="auto"/>
+            </w:pPr>
+            <w:r>
+              <w:rPr>
+                <w:rFonts w:ascii="Times New Roman" w:hAnsi="Times New Roman"/>
+                <w:b w:val="0"/>
+                <w:i w:val="0"/>
+                <w:color w:val="1F2937"/>
+                <w:sz w:val="22"/>
+              </w:rPr>
+              <w:t>• Lâm Đồng: 80,22% (W39: 66,85%, tăng bùng nổ +13,37%p!) ➔ Lần đầu tiên vượt ngưỡng 80% Ca 1 TTS!</w:t>
+            </w:r>
+          </w:p>
+          <w:p>
+            <w:pPr>
+              <w:spacing w:before="40" w:after="80" w:line="276" w:lineRule="auto"/>
+            </w:pPr>
+            <w:r>
+              <w:rPr>
+                <w:rFonts w:ascii="Times New Roman" w:hAnsi="Times New Roman"/>
+                <w:b w:val="0"/>
+                <w:i w:val="0"/>
+                <w:color w:val="1F2937"/>
+                <w:sz w:val="22"/>
+              </w:rPr>
+              <w:t>• Khánh Hòa: 80,15% (W39: 75,77%, tăng +4,37%p) ➔ Đạt chuẩn xuất sắc &gt;80%.</w:t>
+            </w:r>
+          </w:p>
+          <w:p>
+            <w:pPr>
+              <w:spacing w:before="40" w:after="80" w:line="276" w:lineRule="auto"/>
+            </w:pPr>
+            <w:r>
+              <w:rPr>
+                <w:rFonts w:ascii="Times New Roman" w:hAnsi="Times New Roman"/>
+                <w:b w:val="0"/>
+                <w:i w:val="0"/>
+                <w:color w:val="1F2937"/>
+                <w:sz w:val="22"/>
+              </w:rPr>
+              <w:t>• Đắk Nông: 72,78% (W39: 67,81%, tăng mạnh +4,97%p).</w:t>
+            </w:r>
+          </w:p>
+          <w:p>
+            <w:pPr>
+              <w:spacing w:before="40" w:after="80" w:line="276" w:lineRule="auto"/>
+            </w:pPr>
+            <w:r>
+              <w:rPr>
+                <w:rFonts w:ascii="Times New Roman" w:hAnsi="Times New Roman"/>
+                <w:b w:val="0"/>
+                <w:i w:val="0"/>
+                <w:color w:val="1F2937"/>
+                <w:sz w:val="22"/>
+              </w:rPr>
+              <w:t>📍 3. TOP AM GIAO CA 1 HÀNG THUẦN TIKTOK SHOP XUẤT SẮC NHẤT:</w:t>
+            </w:r>
+          </w:p>
+          <w:p>
+            <w:pPr>
+              <w:spacing w:before="40" w:after="80" w:line="276" w:lineRule="auto"/>
+            </w:pPr>
+            <w:r>
+              <w:rPr>
+                <w:rFonts w:ascii="Times New Roman" w:hAnsi="Times New Roman"/>
+                <w:b w:val="0"/>
+                <w:i w:val="0"/>
+                <w:color w:val="1F2937"/>
+                <w:sz w:val="22"/>
+              </w:rPr>
+              <w:t>• Top 1 GTC Ca 1 TTS: AM Nguyễn Ngọc Khánh đạt 88,94%, kế đến là AM Nguyễn Đỗ Minh Nghĩa đạt 87,02%, AM Cao Thị Thanh Thủy đạt 87,01%.</w:t>
+            </w:r>
+          </w:p>
+          <w:p>
+            <w:pPr>
+              <w:spacing w:before="40" w:after="80" w:line="276" w:lineRule="auto"/>
+            </w:pPr>
+            <w:r>
+              <w:rPr>
+                <w:rFonts w:ascii="Times New Roman" w:hAnsi="Times New Roman"/>
+                <w:b w:val="0"/>
+                <w:i w:val="0"/>
+                <w:color w:val="1F2937"/>
+                <w:sz w:val="22"/>
+              </w:rPr>
+              <w:t>• Đầu tàu gánh tải Ca 1 TTS lớn nhất: AM Nguyễn Duy Long xử lý hơn 10 ngàn đơn (10.257 đơn) với tỷ lệ giao thành công lên tới 85,05%!</w:t>
+            </w:r>
+          </w:p>
+          <w:p>
+            <w:pPr>
+              <w:spacing w:before="40" w:after="80" w:line="276" w:lineRule="auto"/>
+            </w:pPr>
+            <w:r>
+              <w:rPr>
+                <w:rFonts w:ascii="Times New Roman" w:hAnsi="Times New Roman"/>
+                <w:b w:val="0"/>
+                <w:i w:val="0"/>
+                <w:color w:val="1F2937"/>
+                <w:sz w:val="22"/>
+              </w:rPr>
+              <w:t>• Đóng góp bứt phá nhất Ca 1 TTS: AM Lê Văn Trường tăng vọt +24,72%p (từ 55,56% lên 80,28%) và AM Nguyễn Thanh Long tăng +16,40%p (từ 66,58% lên 82,98%).</w:t>
             </w:r>
           </w:p>
           <w:p>
@@ -2192,37 +2237,67 @@
                 <w:color w:val="1F2937"/>
                 <w:sz w:val="22"/>
               </w:rPr>
-              <w:t>"Dạ khi chuyển sang Tab 4 và Tab 5 mổ xẻ chi tiết ca sáng, mọi người sẽ thấy rõ điểm nghẽn thực sự của khâu Last-mile:</w:t>
-            </w:r>
-          </w:p>
-          <w:p>
-            <w:pPr>
-              <w:spacing w:before="40" w:after="80" w:line="276" w:lineRule="auto"/>
-            </w:pPr>
-            <w:r>
-              <w:rPr>
-                <w:rFonts w:ascii="Times New Roman" w:hAnsi="Times New Roman"/>
-                <w:b w:val="0"/>
-                <w:i w:val="0"/>
-                <w:color w:val="1F2937"/>
-                <w:sz w:val="22"/>
-              </w:rPr>
-              <w:t>Nhìn vào hàng thuần mới về sáng sớm, toàn vùng giao cực kỳ tốt, đạt tới 72,4%, riêng đơn TikTok Shop lên tới gần 76%, chạm đúng trần kỳ vọng của sàn.</w:t>
-            </w:r>
-          </w:p>
-          <w:p>
-            <w:pPr>
-              <w:spacing w:before="40" w:after="80" w:line="276" w:lineRule="auto"/>
-            </w:pPr>
-            <w:r>
-              <w:rPr>
-                <w:rFonts w:ascii="Times New Roman" w:hAnsi="Times New Roman"/>
-                <w:b w:val="0"/>
-                <w:i w:val="0"/>
-                <w:color w:val="1F2937"/>
-                <w:sz w:val="22"/>
-              </w:rPr>
-              <w:t>Nhưng khi nhìn sang thẻ Hàng Tồn ở Tab 4, tỷ lệ thành công lập tức tụt xuống còn 52,8%, chênh lệch nhau tới gần 20%p!</w:t>
+              <w:t>"Dạ khi chuyển sang Tab 4 và Tab 5 mổ xẻ chi tiết ca phát sáng, mọi người sẽ thấy một điểm sáng rất đáng tự hào:</w:t>
+            </w:r>
+          </w:p>
+          <w:p>
+            <w:pPr>
+              <w:spacing w:before="40" w:after="80" w:line="276" w:lineRule="auto"/>
+            </w:pPr>
+            <w:r>
+              <w:rPr>
+                <w:rFonts w:ascii="Times New Roman" w:hAnsi="Times New Roman"/>
+                <w:b w:val="0"/>
+                <w:i w:val="0"/>
+                <w:color w:val="1F2937"/>
+                <w:sz w:val="22"/>
+              </w:rPr>
+              <w:t>Đối với hàng thuần mới về sáng sớm, tỷ lệ giao thành công Full hàng toàn vùng đã tăng lên 77,35%, và đặc biệt là phân khúc TikTok Shop (TTS) tuần này đã chính thức bứt phá ngoạn mục vượt qua mốc 81% (đạt 81,34%, tăng mạnh +6,17%p so với mức 75,16% của W39)! Cả 4/5 tỉnh gồm Bình Thuận (86,5%), Ninh Thuận (83,8%), Lâm Đồng (80,2%) và Khánh Hòa (80,2%) đều đã xuất sắc vượt qua mốc 80% đối với hàng sàn Ca 1 sáng!</w:t>
+            </w:r>
+          </w:p>
+          <w:p>
+            <w:pPr>
+              <w:spacing w:before="40" w:after="80" w:line="276" w:lineRule="auto"/>
+            </w:pPr>
+            <w:r>
+              <w:rPr>
+                <w:rFonts w:ascii="Times New Roman" w:hAnsi="Times New Roman"/>
+                <w:b w:val="0"/>
+                <w:i w:val="0"/>
+                <w:color w:val="1F2937"/>
+                <w:sz w:val="22"/>
+              </w:rPr>
+              <w:t>Soi vào AM: Anh Khánh (88,9%), anh Nghĩa (87,0%), chị Thủy (87,0%) và anh Long (85,1% trên hơn 10 ngàn đơn) đều có tỷ lệ giao ca sáng cực kỳ ấn tượng.</w:t>
+            </w:r>
+          </w:p>
+          <w:p>
+            <w:pPr>
+              <w:spacing w:before="40" w:after="80" w:line="276" w:lineRule="auto"/>
+            </w:pPr>
+            <w:r>
+              <w:rPr>
+                <w:rFonts w:ascii="Times New Roman" w:hAnsi="Times New Roman"/>
+                <w:b w:val="0"/>
+                <w:i w:val="0"/>
+                <w:color w:val="1F2937"/>
+                <w:sz w:val="22"/>
+              </w:rPr>
+              <w:t>Đặc biệt, anh Lê Văn Trường ở Lâm Đồng đã kéo GTC Ca 1 TTS tăng phi mã tới gần +25%p (từ 55,6% lên 80,3%), chứng minh khi anh em tập trung xuất tuyến sớm, đơn sàn giao cực kỳ thoát!</w:t>
+            </w:r>
+          </w:p>
+          <w:p>
+            <w:pPr>
+              <w:spacing w:before="40" w:after="80" w:line="276" w:lineRule="auto"/>
+            </w:pPr>
+            <w:r>
+              <w:rPr>
+                <w:rFonts w:ascii="Times New Roman" w:hAnsi="Times New Roman"/>
+                <w:b w:val="0"/>
+                <w:i w:val="0"/>
+                <w:color w:val="1F2937"/>
+                <w:sz w:val="22"/>
+              </w:rPr>
+              <w:t>Tuy nhiên, khi nhìn sang thẻ Hàng Tồn ở Tab 4, tỷ lệ thành công chung lập tức tụt xuống còn 63,56%, chênh lệch nhau tới gần 14%p!</w:t>
             </w:r>
           </w:p>
           <w:p>
@@ -2252,37 +2327,37 @@
                 <w:color w:val="1F2937"/>
                 <w:sz w:val="22"/>
               </w:rPr>
-              <w:t>Qua kiểm tra thực tế tại các kho bưu cục ở Đà Lạt và Gia Nghĩa, em thấy shipper sáng ra lấy hàng chỉ chăm chăm lựa các kiện hàng thuần mới tinh để giao cho nhanh lấy số. Còn các đơn tồn từ hôm trước dồn lại thì để dưới đáy sọt hoặc để lại góc kho, không ưu tiên phát sớm.</w:t>
-            </w:r>
-          </w:p>
-          <w:p>
-            <w:pPr>
-              <w:spacing w:before="40" w:after="80" w:line="276" w:lineRule="auto"/>
-            </w:pPr>
-            <w:r>
-              <w:rPr>
-                <w:rFonts w:ascii="Times New Roman" w:hAnsi="Times New Roman"/>
-                <w:b w:val="0"/>
-                <w:i w:val="0"/>
-                <w:color w:val="1F2937"/>
-                <w:sz w:val="22"/>
-              </w:rPr>
-              <w:t>Hàng tồn để càng lâu thì tỷ lệ khách hủy càng cao. Ở Lâm Đồng hàng tồn Ca 1 chỉ đạt 48,2% và Đắk Nông đạt 49,5%.</w:t>
-            </w:r>
-          </w:p>
-          <w:p>
-            <w:pPr>
-              <w:spacing w:before="40" w:after="80" w:line="276" w:lineRule="auto"/>
-            </w:pPr>
-            <w:r>
-              <w:rPr>
-                <w:rFonts w:ascii="Times New Roman" w:hAnsi="Times New Roman"/>
-                <w:b w:val="0"/>
-                <w:i w:val="0"/>
-                <w:color w:val="1F2937"/>
-                <w:sz w:val="22"/>
-              </w:rPr>
-              <w:t>Anh Trường, anh Tiến với anh Linh phải quán triệt lại cho bưu tá: Quy tắc bất di bất dịch của GHN là 'First In - First Out', hàng cũ tồn hôm qua phải được gán và mang đi phát ngay chuyến đầu tiên lúc 8h sáng, không được găm hàng lại bưu cục!"</w:t>
+              <w:t>Bởi vì shipper sáng ra lấy hàng vẫn còn thói quen lựa các kiện hàng thuần mới tinh để giao trước cho nhanh. Còn các đơn tồn từ hôm trước dồn lại thì để dưới đáy sọt hoặc để lại góc kho, không ưu tiên phát sớm.</w:t>
+            </w:r>
+          </w:p>
+          <w:p>
+            <w:pPr>
+              <w:spacing w:before="40" w:after="80" w:line="276" w:lineRule="auto"/>
+            </w:pPr>
+            <w:r>
+              <w:rPr>
+                <w:rFonts w:ascii="Times New Roman" w:hAnsi="Times New Roman"/>
+                <w:b w:val="0"/>
+                <w:i w:val="0"/>
+                <w:color w:val="1F2937"/>
+                <w:sz w:val="22"/>
+              </w:rPr>
+              <w:t>Hàng tồn để càng lâu thì tỷ lệ khách đổi ý không lấy càng cao.</w:t>
+            </w:r>
+          </w:p>
+          <w:p>
+            <w:pPr>
+              <w:spacing w:before="40" w:after="80" w:line="276" w:lineRule="auto"/>
+            </w:pPr>
+            <w:r>
+              <w:rPr>
+                <w:rFonts w:ascii="Times New Roman" w:hAnsi="Times New Roman"/>
+                <w:b w:val="0"/>
+                <w:i w:val="0"/>
+                <w:color w:val="1F2937"/>
+                <w:sz w:val="22"/>
+              </w:rPr>
+              <w:t>Em đề nghị các AM nhóm dưới như anh Trường, anh Vũ và anh Linh phải quán triệt lại cho bưu tá: Quy tắc bất di bất dịch của GHN là 'First In - First Out', hàng cũ tồn hôm qua phải được gán và mang đi phát ngay chuyến đầu tiên lúc 8h sáng, không được găm hàng lại bưu cục!"</w:t>
             </w:r>
           </w:p>
           <w:p>
@@ -2314,7 +2389,7 @@
                 <w:color w:val="1F2937"/>
                 <w:sz w:val="21"/>
               </w:rPr>
-              <w:t>• Hàng thuần ca 1 đạt 75,8% TTS chứng minh năng lực giao hàng của shipper GHN rất tốt khi khách có nhu cầu nhận ngay.</w:t>
+              <w:t>• Hàng thuần Ca 1 TikTok Shop đạt kỷ lục 81,34% (tăng +6,17%p WoW), chứng minh khách hàng mua sàn TMĐT có nhu cầu nhận hàng ca sáng rất cao và shipper giao rất hiệu quả.</w:t>
             </w:r>
           </w:p>
           <w:p>
@@ -2330,7 +2405,7 @@
                 <w:color w:val="1F2937"/>
                 <w:sz w:val="21"/>
               </w:rPr>
-              <w:t>• Độ trễ 20%p giữa hàng tồn và hàng thuần khẳng định shipper đang phân biệt đối xử với các kiện hàng cũ.</w:t>
+              <w:t>• Độ lệch ~14%p giữa hàng thuần (77,35%) và hàng tồn (63,56%) khẳng định shipper vẫn còn tâm lý ưu tiên hàng mới, bỏ bê hàng tồn hôm trước.</w:t>
             </w:r>
           </w:p>
           <w:p>
@@ -2362,7 +2437,7 @@
                 <w:color w:val="991B1B"/>
                 <w:sz w:val="21"/>
               </w:rPr>
-              <w:t>• Đơn tồn ca 1 dưới 50% tại Lâm Đồng và Đắk Nông đang biến hàng trăm kiện hàng thành đơn tồn aging và tăng tỷ lệ hoàn trả oan uổng.</w:t>
+              <w:t>• Cần kiểm soát chặt chẽ việc shipper không chịu mang hàng tồn đi phát chuyến 1 đầu ngày, dẫn tới trôi sang ca chiều và rớt GTC.</w:t>
             </w:r>
           </w:p>
           <w:p>

</xml_diff>

<commit_message>
feat(script): add aging reduction of 71.11% vs N-7 and national share to presentation
</commit_message>
<xml_diff>
--- a/KICH_BAN_THUYET_TRINH_W40_NAM_TRUNG_BO.docx
+++ b/KICH_BAN_THUYET_TRINH_W40_NAM_TRUNG_BO.docx
@@ -322,6 +322,19 @@
                 <w:color w:val="334155"/>
                 <w:sz w:val="19"/>
               </w:rPr>
+              <w:t>Điểm sáng thứ ba đặc biệt ấn tượng là khâu xả hàng tồn Aging: Toàn vùng Nam Trung Bộ tuần này đã kéo giảm lượng tồn tới hơn 71% so với cùng kỳ tuần trước (chính xác là -71,11%), đưa tỷ trọng tồn kho của NTB xuống chỉ còn 3,2% trên toàn quốc — nằm trong nhóm các vùng kiểm soát kho bãi sạch nhất mạng lưới.</w:t>
+            </w:r>
+          </w:p>
+          <w:p>
+            <w:pPr>
+              <w:spacing w:before="20" w:after="40" w:line="276" w:lineRule="auto"/>
+            </w:pPr>
+            <w:r>
+              <w:rPr>
+                <w:rFonts w:ascii="Arial" w:hAnsi="Arial"/>
+                <w:color w:val="334155"/>
+                <w:sz w:val="19"/>
+              </w:rPr>
               <w:t>Về quản trị dòng tiền, tỷ lệ nộp COD bằng chuyển khoản QR tuần này duy trì ở mức 59,6%.</w:t>
             </w:r>
           </w:p>
@@ -5711,33 +5724,85 @@
                 <w:color w:val="0F172A"/>
                 <w:sz w:val="20"/>
               </w:rPr>
-              <w:t>📍 1. BẢNG 1: TỔNG QUAN HÀNG AGING TỒN KHO (&gt;5 NGÀY) TOÀN VÙNG:</w:t>
-            </w:r>
-          </w:p>
-          <w:p>
-            <w:pPr>
-              <w:spacing w:before="20" w:after="40" w:line="276" w:lineRule="auto"/>
-            </w:pPr>
-            <w:r>
-              <w:rPr>
-                <w:rFonts w:ascii="Arial" w:hAnsi="Arial"/>
-                <w:color w:val="334155"/>
-                <w:sz w:val="19"/>
-              </w:rPr>
-              <w:t>• Tổng số đơn tồn Aging &gt;5 ngày toàn vùng: 431 đơn hàng (kiểm soát tương đối tốt so với quy mô sản lượng vùng).</w:t>
-            </w:r>
-          </w:p>
-          <w:p>
-            <w:pPr>
-              <w:spacing w:before="20" w:after="40" w:line="276" w:lineRule="auto"/>
-            </w:pPr>
-            <w:r>
-              <w:rPr>
-                <w:rFonts w:ascii="Arial" w:hAnsi="Arial"/>
-                <w:color w:val="334155"/>
-                <w:sz w:val="19"/>
-              </w:rPr>
-              <w:t>• Phân bổ theo các dải thời gian lưu kho:</w:t>
+              <w:t>📍 1. BẢNG 1: TỔNG QUAN TIẾN ĐỘ XẢ TỒN AGING VÀ SO SÁNH TOÀN QUỐC:</w:t>
+            </w:r>
+          </w:p>
+          <w:p>
+            <w:pPr>
+              <w:spacing w:before="20" w:after="40" w:line="276" w:lineRule="auto"/>
+            </w:pPr>
+            <w:r>
+              <w:rPr>
+                <w:rFonts w:ascii="Arial" w:hAnsi="Arial"/>
+                <w:color w:val="334155"/>
+                <w:sz w:val="19"/>
+              </w:rPr>
+              <w:t>• Thành tích bứt phá ngoạn mục: Lượng tồn Aging toàn vùng Nam Trung Bộ đã GIẢM TỚI 71,11% (hơn 71%) so với cùng kỳ tuần trước (N-7)!</w:t>
+            </w:r>
+          </w:p>
+          <w:p>
+            <w:pPr>
+              <w:spacing w:before="20" w:after="40" w:line="276" w:lineRule="auto"/>
+            </w:pPr>
+            <w:r>
+              <w:rPr>
+                <w:rFonts w:ascii="Arial" w:hAnsi="Arial"/>
+                <w:color w:val="334155"/>
+                <w:sz w:val="19"/>
+              </w:rPr>
+              <w:t>• Diễn biến giải tỏa tồn kho liên tục theo ngày:</w:t>
+            </w:r>
+          </w:p>
+          <w:p>
+            <w:pPr>
+              <w:spacing w:before="20" w:after="40" w:line="276" w:lineRule="auto"/>
+            </w:pPr>
+            <w:r>
+              <w:rPr>
+                <w:rFonts w:ascii="Arial" w:hAnsi="Arial"/>
+                <w:color w:val="334155"/>
+                <w:sz w:val="19"/>
+              </w:rPr>
+              <w:t xml:space="preserve">  - 28/09: 1.322 đơn ➔ 29/09: 1.184 đơn ➔ 30/09: 1.204 đơn ➔ 01/10: 943 đơn</w:t>
+            </w:r>
+          </w:p>
+          <w:p>
+            <w:pPr>
+              <w:spacing w:before="20" w:after="40" w:line="276" w:lineRule="auto"/>
+            </w:pPr>
+            <w:r>
+              <w:rPr>
+                <w:rFonts w:ascii="Arial" w:hAnsi="Arial"/>
+                <w:color w:val="334155"/>
+                <w:sz w:val="19"/>
+              </w:rPr>
+              <w:t xml:space="preserve">  - 02/10: 758 đơn ➔ 03/10: 508 đơn ➔ 04/10: 399 đơn ➔ 05/10: 352 đơn ➔ 06/10: 342 đơn (tiếp tục giảm -2,84% so với N-1).</w:t>
+            </w:r>
+          </w:p>
+          <w:p>
+            <w:pPr>
+              <w:spacing w:before="20" w:after="40" w:line="276" w:lineRule="auto"/>
+            </w:pPr>
+            <w:r>
+              <w:rPr>
+                <w:rFonts w:ascii="Arial" w:hAnsi="Arial"/>
+                <w:color w:val="334155"/>
+                <w:sz w:val="19"/>
+              </w:rPr>
+              <w:t>• Vị thế trên toàn quốc: Tỷ trọng tồn Aging của NTB hiện CHỈ CHIẾM 3,2% toàn quốc (trong khi ĐNB chiếm 31,6%, HCM 12,6%, ĐBB 9,2%, HNO 9,7%). NTB là một trong những vùng kiểm soát tồn sạch nhất hệ thống!</w:t>
+            </w:r>
+          </w:p>
+          <w:p>
+            <w:pPr>
+              <w:spacing w:before="20" w:after="40" w:line="276" w:lineRule="auto"/>
+            </w:pPr>
+            <w:r>
+              <w:rPr>
+                <w:rFonts w:ascii="Arial" w:hAnsi="Arial"/>
+                <w:color w:val="334155"/>
+                <w:sz w:val="19"/>
+              </w:rPr>
+              <w:t>• Phân bổ 431 đơn lưu kho (&gt;5 ngày) theo dải thời gian:</w:t>
             </w:r>
           </w:p>
           <w:p>
@@ -6193,122 +6258,186 @@
                 <w:color w:val="0F172A"/>
                 <w:sz w:val="19"/>
               </w:rPr>
-              <w:t>"Kính thưa Ban Giám Đốc và các anh chị em AM, em xin phép chuyển sang Tab 12 để theo dõi sát hai mảng tồn đọng: Hàng Aging lưu kho và Hàng Treo luân chuyển.</w:t>
-            </w:r>
-          </w:p>
-          <w:p>
-            <w:pPr>
-              <w:spacing w:before="20" w:after="40" w:line="276" w:lineRule="auto"/>
-            </w:pPr>
-            <w:r>
-              <w:rPr>
-                <w:rFonts w:ascii="Arial" w:hAnsi="Arial"/>
-                <w:color w:val="334155"/>
-                <w:sz w:val="19"/>
-              </w:rPr>
-            </w:r>
-          </w:p>
-          <w:p>
-            <w:pPr>
-              <w:spacing w:before="20" w:after="40" w:line="276" w:lineRule="auto"/>
-            </w:pPr>
-            <w:r>
-              <w:rPr>
-                <w:rFonts w:ascii="Arial" w:hAnsi="Arial"/>
-                <w:color w:val="334155"/>
-                <w:sz w:val="19"/>
-              </w:rPr>
-              <w:t>Thứ nhất, nhìn vào Báo cáo Hàng Aging tồn kho (&gt;5 ngày):</w:t>
-            </w:r>
-          </w:p>
-          <w:p>
-            <w:pPr>
-              <w:spacing w:before="20" w:after="40" w:line="276" w:lineRule="auto"/>
-            </w:pPr>
-            <w:r>
-              <w:rPr>
-                <w:rFonts w:ascii="Arial" w:hAnsi="Arial"/>
-                <w:color w:val="334155"/>
-                <w:sz w:val="19"/>
-              </w:rPr>
-              <w:t>Tin vui là toàn vùng chúng ta hiện chỉ ghi nhận 431 đơn hàng lưu kho trên 5 ngày — một con số khá khiêm tốn so với quy mô hàng trăm ngàn đơn mỗi tuần.</w:t>
-            </w:r>
-          </w:p>
-          <w:p>
-            <w:pPr>
-              <w:spacing w:before="20" w:after="40" w:line="276" w:lineRule="auto"/>
-            </w:pPr>
-            <w:r>
-              <w:rPr>
-                <w:rFonts w:ascii="Arial" w:hAnsi="Arial"/>
-                <w:color w:val="334155"/>
-                <w:sz w:val="19"/>
-              </w:rPr>
-              <w:t>Trong 431 đơn này, có tới 84,7% (365 đơn) là mới chớm bước qua ngày thứ 5 đến ngày thứ 8; đơn tồn từ 8 đến 15 ngày là 59 đơn; và đơn tồn lâu trên 15 ngày chỉ có 7 đơn.</w:t>
-            </w:r>
-          </w:p>
-          <w:p>
-            <w:pPr>
-              <w:spacing w:before="20" w:after="40" w:line="276" w:lineRule="auto"/>
-            </w:pPr>
-            <w:r>
-              <w:rPr>
-                <w:rFonts w:ascii="Arial" w:hAnsi="Arial"/>
-                <w:color w:val="334155"/>
-                <w:sz w:val="19"/>
-              </w:rPr>
-              <w:t>Về phía AM, anh Nguyễn Văn B đang có 78 đơn, anh Nguyễn Văn D có 76 đơn, anh Duân có 36 đơn, anh E có 35 đơn và anh C có 34 đơn.</w:t>
-            </w:r>
-          </w:p>
-          <w:p>
-            <w:pPr>
-              <w:spacing w:before="20" w:after="40" w:line="276" w:lineRule="auto"/>
-            </w:pPr>
-            <w:r>
-              <w:rPr>
-                <w:rFonts w:ascii="Arial" w:hAnsi="Arial"/>
-                <w:color w:val="334155"/>
-                <w:sz w:val="19"/>
-              </w:rPr>
-              <w:t>Với nhóm Aging này, do phần lớn mới chớm ở ngưỡng 5–8 ngày, nên việc xử lý tương đối thuận lợi. Em đề nghị các AM phối hợp trực tiếp với trưởng bưu cục kiểm đếm nhanh: Đơn nào khách hẹn giao lại thì ưu tiên cho bưu tá giao dứt điểm trong ca; đơn nào khách từ chối nhận thì chuyển trạng thái hoàn ngay, tránh để ngâm kho kéo dài sang mốc 15 ngày.</w:t>
-            </w:r>
-          </w:p>
-          <w:p>
-            <w:pPr>
-              <w:spacing w:before="20" w:after="40" w:line="276" w:lineRule="auto"/>
-            </w:pPr>
-            <w:r>
-              <w:rPr>
-                <w:rFonts w:ascii="Arial" w:hAnsi="Arial"/>
-                <w:color w:val="334155"/>
-                <w:sz w:val="19"/>
-              </w:rPr>
-            </w:r>
-          </w:p>
-          <w:p>
-            <w:pPr>
-              <w:spacing w:before="20" w:after="40" w:line="276" w:lineRule="auto"/>
-            </w:pPr>
-            <w:r>
-              <w:rPr>
-                <w:rFonts w:ascii="Arial" w:hAnsi="Arial"/>
-                <w:color w:val="334155"/>
-                <w:sz w:val="19"/>
-              </w:rPr>
-              <w:t>Thứ hai, chuyển sang tab Báo cáo Hàng Treo luân chuyển:</w:t>
-            </w:r>
-          </w:p>
-          <w:p>
-            <w:pPr>
-              <w:spacing w:before="20" w:after="40" w:line="276" w:lineRule="auto"/>
-            </w:pPr>
-            <w:r>
-              <w:rPr>
-                <w:rFonts w:ascii="Arial" w:hAnsi="Arial"/>
-                <w:color w:val="334155"/>
-                <w:sz w:val="19"/>
-              </w:rPr>
-              <w:t>Hiện tại toàn vùng có 4.660 đơn đang nằm trên luồng luân chuyển. Điểm rất tích cực là có tới 92,0% (tương đương 4.287 đơn) luân chuyển hoàn toàn đúng hạn dưới 24h.</w:t>
+              <w:t>"Kính thưa Ban Giám Đốc và các anh chị em AM, chuyển sang Tab 12 về tình hình Hàng tồn Aging và Treo luân chuyển:</w:t>
+            </w:r>
+          </w:p>
+          <w:p>
+            <w:pPr>
+              <w:spacing w:before="20" w:after="40" w:line="276" w:lineRule="auto"/>
+            </w:pPr>
+            <w:r>
+              <w:rPr>
+                <w:rFonts w:ascii="Arial" w:hAnsi="Arial"/>
+                <w:color w:val="334155"/>
+                <w:sz w:val="19"/>
+              </w:rPr>
+            </w:r>
+          </w:p>
+          <w:p>
+            <w:pPr>
+              <w:spacing w:before="20" w:after="40" w:line="276" w:lineRule="auto"/>
+            </w:pPr>
+            <w:r>
+              <w:rPr>
+                <w:rFonts w:ascii="Arial" w:hAnsi="Arial"/>
+                <w:color w:val="334155"/>
+                <w:sz w:val="19"/>
+              </w:rPr>
+              <w:t>Điểm sáng rất ấn tượng đầu tiên mà em muốn báo cáo với Ban Giám Đốc là:</w:t>
+            </w:r>
+          </w:p>
+          <w:p>
+            <w:pPr>
+              <w:spacing w:before="20" w:after="40" w:line="276" w:lineRule="auto"/>
+            </w:pPr>
+            <w:r>
+              <w:rPr>
+                <w:rFonts w:ascii="Arial" w:hAnsi="Arial"/>
+                <w:color w:val="334155"/>
+                <w:sz w:val="19"/>
+              </w:rPr>
+              <w:t>Theo số liệu theo dõi toàn mạng lưới, lượng hàng tồn Aging của vùng Nam Trung Bộ chúng ta tuần này đã có bước bứt phá xả hàng cực kỳ ngoạn mục:</w:t>
+            </w:r>
+          </w:p>
+          <w:p>
+            <w:pPr>
+              <w:spacing w:before="20" w:after="40" w:line="276" w:lineRule="auto"/>
+            </w:pPr>
+            <w:r>
+              <w:rPr>
+                <w:rFonts w:ascii="Arial" w:hAnsi="Arial"/>
+                <w:color w:val="334155"/>
+                <w:sz w:val="19"/>
+              </w:rPr>
+              <w:t>So với cùng kỳ 7 ngày trước (N-7), toàn vùng NTB đã kéo giảm lượng tồn tới hơn 71% (chính xác là giảm 71,11%)!</w:t>
+            </w:r>
+          </w:p>
+          <w:p>
+            <w:pPr>
+              <w:spacing w:before="20" w:after="40" w:line="276" w:lineRule="auto"/>
+            </w:pPr>
+            <w:r>
+              <w:rPr>
+                <w:rFonts w:ascii="Arial" w:hAnsi="Arial"/>
+                <w:color w:val="334155"/>
+                <w:sz w:val="19"/>
+              </w:rPr>
+              <w:t>Các anh chị có thể thấy trên biểu đồ diễn biến từng ngày: Đầu chu kỳ ngày 28/09 toàn vùng ghi nhận 1.322 đơn, nhưng các bưu cục đã xả tồn quyết liệt qua từng ngày: xuống 943 đơn vào ngày 01/10, xuống 758 đơn ngày 02/10, ngày 04/10 chỉ còn 399 đơn, và đến ngày hôm nay 06/10 chạm mức 342 đơn — tức là tiếp tục giảm thêm 2,84% so với ngày hôm qua.</w:t>
+            </w:r>
+          </w:p>
+          <w:p>
+            <w:pPr>
+              <w:spacing w:before="20" w:after="40" w:line="276" w:lineRule="auto"/>
+            </w:pPr>
+            <w:r>
+              <w:rPr>
+                <w:rFonts w:ascii="Arial" w:hAnsi="Arial"/>
+                <w:color w:val="334155"/>
+                <w:sz w:val="19"/>
+              </w:rPr>
+              <w:t>Nhờ tiến độ xả tồn dốc đứng này, tỷ trọng hàng tồn của Nam Trung Bộ hiện chỉ còn chiếm vỏn vẹn 3,2% trên toàn quốc — trong khi các vùng bạn như Đông Nam Bộ chiếm tới 31,6%, TP.HCM 12,6%, hay Đồng bằng Bắc Bộ 9,2%. Đây là kết quả chứng minh sự vào cuộc rất rốt ráo của các anh chị AM và anh em bưu cục trong việc giải phóng kho bãi!</w:t>
+            </w:r>
+          </w:p>
+          <w:p>
+            <w:pPr>
+              <w:spacing w:before="20" w:after="40" w:line="276" w:lineRule="auto"/>
+            </w:pPr>
+            <w:r>
+              <w:rPr>
+                <w:rFonts w:ascii="Arial" w:hAnsi="Arial"/>
+                <w:color w:val="334155"/>
+                <w:sz w:val="19"/>
+              </w:rPr>
+            </w:r>
+          </w:p>
+          <w:p>
+            <w:pPr>
+              <w:spacing w:before="20" w:after="40" w:line="276" w:lineRule="auto"/>
+            </w:pPr>
+            <w:r>
+              <w:rPr>
+                <w:rFonts w:ascii="Arial" w:hAnsi="Arial"/>
+                <w:color w:val="334155"/>
+                <w:sz w:val="19"/>
+              </w:rPr>
+              <w:t>Nhìn vào cơ cấu 431 đơn lưu kho trên 5 ngày hiện tại:</w:t>
+            </w:r>
+          </w:p>
+          <w:p>
+            <w:pPr>
+              <w:spacing w:before="20" w:after="40" w:line="276" w:lineRule="auto"/>
+            </w:pPr>
+            <w:r>
+              <w:rPr>
+                <w:rFonts w:ascii="Arial" w:hAnsi="Arial"/>
+                <w:color w:val="334155"/>
+                <w:sz w:val="19"/>
+              </w:rPr>
+              <w:t>Có tới 84,7% (365 đơn) là mới chớm bước qua ngày thứ 5 đến ngày thứ 8; đơn tồn từ 8 đến 15 ngày là 59 đơn; và nhóm tồn lâu trên 15 ngày toàn vùng chỉ còn vỏn vẹn đúng 7 đơn (chiếm 1,6%).</w:t>
+            </w:r>
+          </w:p>
+          <w:p>
+            <w:pPr>
+              <w:spacing w:before="20" w:after="40" w:line="276" w:lineRule="auto"/>
+            </w:pPr>
+            <w:r>
+              <w:rPr>
+                <w:rFonts w:ascii="Arial" w:hAnsi="Arial"/>
+                <w:color w:val="334155"/>
+                <w:sz w:val="19"/>
+              </w:rPr>
+              <w:t>Về phía AM, anh Nguyễn Văn B hiện có 78 đơn, anh Nguyễn Văn D có 76 đơn, anh Duân có 36 đơn, anh E có 35 đơn và anh C có 34 đơn.</w:t>
+            </w:r>
+          </w:p>
+          <w:p>
+            <w:pPr>
+              <w:spacing w:before="20" w:after="40" w:line="276" w:lineRule="auto"/>
+            </w:pPr>
+            <w:r>
+              <w:rPr>
+                <w:rFonts w:ascii="Arial" w:hAnsi="Arial"/>
+                <w:color w:val="334155"/>
+                <w:sz w:val="19"/>
+              </w:rPr>
+              <w:t>Với nhóm Aging này, do phần lớn mới chớm ở ngưỡng 5–8 ngày, nên việc xử lý tương đối thuận lợi. Em đề nghị các AM phối hợp trực tiếp với trưởng bưu cục kiểm đếm nhanh: Đơn nào khách hẹn giao lại thì ưu tiên cho bưu tá giao dứt điểm trong ca; đơn nào khách từ chối nhận thì chuyển trạng thái hoàn ngay, dứt khoát không để ngâm kho kéo dài sang mốc 15 ngày.</w:t>
+            </w:r>
+          </w:p>
+          <w:p>
+            <w:pPr>
+              <w:spacing w:before="20" w:after="40" w:line="276" w:lineRule="auto"/>
+            </w:pPr>
+            <w:r>
+              <w:rPr>
+                <w:rFonts w:ascii="Arial" w:hAnsi="Arial"/>
+                <w:color w:val="334155"/>
+                <w:sz w:val="19"/>
+              </w:rPr>
+            </w:r>
+          </w:p>
+          <w:p>
+            <w:pPr>
+              <w:spacing w:before="20" w:after="40" w:line="276" w:lineRule="auto"/>
+            </w:pPr>
+            <w:r>
+              <w:rPr>
+                <w:rFonts w:ascii="Arial" w:hAnsi="Arial"/>
+                <w:color w:val="334155"/>
+                <w:sz w:val="19"/>
+              </w:rPr>
+              <w:t>Thứ hai, chuyển sang mảng Hàng Treo luân chuyển:</w:t>
+            </w:r>
+          </w:p>
+          <w:p>
+            <w:pPr>
+              <w:spacing w:before="20" w:after="40" w:line="276" w:lineRule="auto"/>
+            </w:pPr>
+            <w:r>
+              <w:rPr>
+                <w:rFonts w:ascii="Arial" w:hAnsi="Arial"/>
+                <w:color w:val="334155"/>
+                <w:sz w:val="19"/>
+              </w:rPr>
+              <w:t>Hiện tại toàn vùng có 4.660 đơn đang nằm trên luồng luân chuyển. Điểm rất tích cực là có tới 92,0% (tương đương 4.287 đơn) luân chuyển hoàn toàn đúng hạn dưới 24h, dòng chảy vận hành cơ bản thông suốt.</w:t>
             </w:r>
           </w:p>
           <w:p>
@@ -6386,20 +6515,20 @@
                 <w:color w:val="334155"/>
                 <w:sz w:val="19"/>
               </w:rPr>
-              <w:t>1. Xe trung chuyển KTC đã hạ tải tại bưu cục nhưng bưu cục chưa quét xác nhận nhập kho kịp thời vào hệ thống, khiến trạng thái đơn vẫn hiển thị là đang luân chuyển trên đường.</w:t>
-            </w:r>
-          </w:p>
-          <w:p>
-            <w:pPr>
-              <w:spacing w:before="20" w:after="40" w:line="276" w:lineRule="auto"/>
-            </w:pPr>
-            <w:r>
-              <w:rPr>
-                <w:rFonts w:ascii="Arial" w:hAnsi="Arial"/>
-                <w:color w:val="334155"/>
-                <w:sz w:val="19"/>
-              </w:rPr>
-              <w:t>2. Một số kiện hàng chuyển nhầm tuyến bưu cục phụ trách, dẫn đến việc phải quét luân chuyển nội bộ thêm một vòng nữa.</w:t>
+              <w:t>1. Xe trung chuyển KTC đã hạ tải tại bưu cục nhưng bưu cục chưa quét xác nhận 'Đến Bưu Cục' kịp thời vào hệ thống, khiến trạng thái đơn vẫn hiển thị là đang luân chuyển trên đường.</w:t>
+            </w:r>
+          </w:p>
+          <w:p>
+            <w:pPr>
+              <w:spacing w:before="20" w:after="40" w:line="276" w:lineRule="auto"/>
+            </w:pPr>
+            <w:r>
+              <w:rPr>
+                <w:rFonts w:ascii="Arial" w:hAnsi="Arial"/>
+                <w:color w:val="334155"/>
+                <w:sz w:val="19"/>
+              </w:rPr>
+              <w:t>2. Một số kiện hàng chuyển nhầm tuyến bưu cục phụ trách tại Hub, dẫn đến việc phải quét luân chuyển nội bộ thêm một vòng nữa.</w:t>
             </w:r>
           </w:p>
           <w:p>
@@ -6463,7 +6592,7 @@
                 <w:color w:val="334155"/>
                 <w:sz w:val="19"/>
               </w:rPr>
-              <w:t>Mục tiêu là trong tuần W41, toàn vùng chúng ta sẽ kéo giảm tỷ lệ Treo luân chuyển từ 8,0% xuống dưới 4,0%, và thanh lý dứt điểm 7 đơn Aging trên 15 ngày.</w:t>
+              <w:t>Mục tiêu là trong tuần W41, chúng ta tiếp tục giữ vững đà xả tồn, kéo giảm tỷ lệ Treo luân chuyển từ 8,0% xuống dưới 4,0%, và giải phóng sạch sẽ 7 đơn Aging trên 15 ngày.</w:t>
             </w:r>
           </w:p>
           <w:p>

</xml_diff>

<commit_message>
docs: cap nhat kich ban thuyet trinh chuan 16 tab - chinh xac du lieu KTC 124 chuyen non tai va giong dieu dieu hanh chuyen nghiep
</commit_message>
<xml_diff>
--- a/KICH_BAN_THUYET_TRINH_W40_NAM_TRUNG_BO.docx
+++ b/KICH_BAN_THUYET_TRINH_W40_NAM_TRUNG_BO.docx
@@ -8952,6 +8952,11 @@
               <w:right w:val="single" w:sz="4" w:color="CBD5E1" w:space="0"/>
             </w:tcBorders>
             <w:shd w:fill="F1F5F9"/>
+            <w:shd w:fill="F1F5F9"/>
+            <w:shd w:fill="F1F5F9"/>
+            <w:shd w:fill="F1F5F9"/>
+            <w:shd w:fill="F1F5F9"/>
+            <w:shd w:fill="F1F5F9"/>
           </w:tcPr>
           <w:p>
             <w:pPr>
@@ -8978,98 +8983,697 @@
                 <w:color w:val="0F172A"/>
                 <w:sz w:val="20"/>
               </w:rPr>
-              <w:t>📍 1. BẢNG XẾP HẠNG DOANH THU THEO AM:</w:t>
-            </w:r>
-          </w:p>
-          <w:p>
-            <w:pPr>
-              <w:spacing w:before="20" w:after="40" w:line="276" w:lineRule="auto"/>
-            </w:pPr>
-            <w:r>
-              <w:rPr>
-                <w:rFonts w:ascii="Arial" w:hAnsi="Arial"/>
-                <w:color w:val="334155"/>
-                <w:sz w:val="19"/>
-              </w:rPr>
-              <w:t>• Top AM dẫn đầu doanh thu kinh doanh:</w:t>
-            </w:r>
-          </w:p>
-          <w:p>
-            <w:pPr>
-              <w:spacing w:before="20" w:after="40" w:line="276" w:lineRule="auto"/>
-            </w:pPr>
-            <w:r>
-              <w:rPr>
-                <w:rFonts w:ascii="Arial" w:hAnsi="Arial"/>
-                <w:color w:val="334155"/>
-                <w:sz w:val="19"/>
-              </w:rPr>
-              <w:t xml:space="preserve">  1. Phan Đình Duy (Khánh Hòa): Doanh thu cao nhất toàn vùng.</w:t>
-            </w:r>
-          </w:p>
-          <w:p>
-            <w:pPr>
-              <w:spacing w:before="20" w:after="40" w:line="276" w:lineRule="auto"/>
-            </w:pPr>
-            <w:r>
-              <w:rPr>
-                <w:rFonts w:ascii="Arial" w:hAnsi="Arial"/>
-                <w:color w:val="334155"/>
-                <w:sz w:val="19"/>
-              </w:rPr>
-              <w:t xml:space="preserve">  2. Nguyễn Duy Long (Ninh Thuận): Đóng góp tỷ trọng lớn thứ 2.</w:t>
-            </w:r>
-          </w:p>
-          <w:p>
-            <w:pPr>
-              <w:spacing w:before="20" w:after="40" w:line="276" w:lineRule="auto"/>
-            </w:pPr>
-            <w:r>
-              <w:rPr>
-                <w:rFonts w:ascii="Arial" w:hAnsi="Arial"/>
-                <w:color w:val="334155"/>
-                <w:sz w:val="19"/>
-              </w:rPr>
-              <w:t xml:space="preserve">  3. Nguyễn Ngọc Khánh (Bình Thuận): Doanh thu rất vững chắc.</w:t>
-            </w:r>
-          </w:p>
-          <w:p>
-            <w:pPr>
-              <w:spacing w:before="20" w:after="40" w:line="276" w:lineRule="auto"/>
-            </w:pPr>
-            <w:r>
-              <w:rPr>
-                <w:rFonts w:ascii="Arial" w:hAnsi="Arial"/>
-                <w:color w:val="334155"/>
-                <w:sz w:val="19"/>
-              </w:rPr>
-              <w:t>• Điểm cần lưu ý chăm sóc khách hàng nhóm A:</w:t>
-            </w:r>
-          </w:p>
-          <w:p>
-            <w:pPr>
-              <w:spacing w:before="20" w:after="40" w:line="276" w:lineRule="auto"/>
-            </w:pPr>
-            <w:r>
-              <w:rPr>
-                <w:rFonts w:ascii="Arial" w:hAnsi="Arial"/>
-                <w:color w:val="334155"/>
-                <w:sz w:val="19"/>
-              </w:rPr>
-              <w:t xml:space="preserve">  - Huỳnh Thúc Duân (Đắk Nông): Sản lượng giảm khoảng 1.600 đơn tại cụm Gia Nghĩa và Nhân Cơ.</w:t>
-            </w:r>
-          </w:p>
-          <w:p>
-            <w:pPr>
-              <w:spacing w:before="20" w:after="40" w:line="276" w:lineRule="auto"/>
-            </w:pPr>
-            <w:r>
-              <w:rPr>
-                <w:rFonts w:ascii="Arial" w:hAnsi="Arial"/>
-                <w:color w:val="334155"/>
-                <w:sz w:val="19"/>
-              </w:rPr>
-              <w:t xml:space="preserve">  - Thái Thị Thanh Thư (Khánh Hòa): Hụt khoảng 7.600 đơn tại Nha Trang do một số shop lớn có sự điều chỉnh kênh gửi.</w:t>
+              <w:t>📍 1. BẢNG 1: TỔNG QUAN DOANH THU VÀ SẢN LƯỢNG KINH DOANH (W40 vs W39):</w:t>
+            </w:r>
+          </w:p>
+          <w:p>
+            <w:pPr>
+              <w:spacing w:before="20" w:after="40" w:line="276" w:lineRule="auto"/>
+            </w:pPr>
+            <w:r>
+              <w:rPr>
+                <w:rFonts w:ascii="Arial" w:hAnsi="Arial"/>
+                <w:color w:val="334155"/>
+                <w:sz w:val="19"/>
+              </w:rPr>
+              <w:t>• Tổng sản lượng kinh doanh toàn vùng: 34.412 đơn (W39: 36.516 đơn, giảm -2.104 đơn / -5,77%).</w:t>
+            </w:r>
+          </w:p>
+          <w:p>
+            <w:pPr>
+              <w:spacing w:before="20" w:after="40" w:line="276" w:lineRule="auto"/>
+            </w:pPr>
+            <w:r>
+              <w:rPr>
+                <w:rFonts w:ascii="Arial" w:hAnsi="Arial"/>
+                <w:color w:val="334155"/>
+                <w:sz w:val="19"/>
+              </w:rPr>
+              <w:t>• Tổng doanh thu kinh doanh toàn vùng: 1.084,3 Triệu VNĐ (1.084.291.331 ₫; W39: 1.127,9 Tr ₫, giảm nhẹ -43,6 Tr ₫ / -3,87% WoW).</w:t>
+            </w:r>
+          </w:p>
+          <w:p>
+            <w:pPr>
+              <w:spacing w:before="20" w:after="40" w:line="276" w:lineRule="auto"/>
+            </w:pPr>
+            <w:r>
+              <w:rPr>
+                <w:rFonts w:ascii="Arial" w:hAnsi="Arial"/>
+                <w:color w:val="334155"/>
+                <w:sz w:val="19"/>
+              </w:rPr>
+              <w:t>• Tình hình phát triển khách hàng mới F30:</w:t>
+            </w:r>
+          </w:p>
+          <w:p>
+            <w:pPr>
+              <w:spacing w:before="20" w:after="40" w:line="276" w:lineRule="auto"/>
+            </w:pPr>
+            <w:r>
+              <w:rPr>
+                <w:rFonts w:ascii="Arial" w:hAnsi="Arial"/>
+                <w:color w:val="334155"/>
+                <w:sz w:val="19"/>
+              </w:rPr>
+              <w:t xml:space="preserve">  - Tổng số khách hàng mới phát sinh đơn (F30): 111 shop (W39: 92 shop, tăng bứt phá +19 shop / +20,7%).</w:t>
+            </w:r>
+          </w:p>
+          <w:p>
+            <w:pPr>
+              <w:spacing w:before="20" w:after="40" w:line="276" w:lineRule="auto"/>
+            </w:pPr>
+            <w:r>
+              <w:rPr>
+                <w:rFonts w:ascii="Arial" w:hAnsi="Arial"/>
+                <w:color w:val="334155"/>
+                <w:sz w:val="19"/>
+              </w:rPr>
+              <w:t xml:space="preserve">  - Doanh thu từ shop mới F30: 11,43 Triệu VNĐ (W39: 8,13 Tr ₫, tăng trưởng +3,29 Tr ₫ / +40,5%).</w:t>
+            </w:r>
+          </w:p>
+          <w:p>
+            <w:pPr>
+              <w:spacing w:before="20" w:after="40" w:line="276" w:lineRule="auto"/>
+            </w:pPr>
+            <w:r>
+              <w:rPr>
+                <w:rFonts w:ascii="Arial" w:hAnsi="Arial"/>
+                <w:color w:val="334155"/>
+                <w:sz w:val="19"/>
+              </w:rPr>
+            </w:r>
+          </w:p>
+          <w:p>
+            <w:pPr>
+              <w:spacing w:before="20" w:after="40" w:line="276" w:lineRule="auto"/>
+            </w:pPr>
+            <w:r>
+              <w:rPr>
+                <w:rFonts w:ascii="Arial" w:hAnsi="Arial"/>
+                <w:b/>
+                <w:color w:val="0F172A"/>
+                <w:sz w:val="20"/>
+              </w:rPr>
+              <w:t>📍 2. BẢNG 2: XẾP HẠNG DOANH THU KINH DOANH THEO 16 AM (KỲ 27/9 – 03/10/2026):</w:t>
+            </w:r>
+          </w:p>
+          <w:p>
+            <w:pPr>
+              <w:spacing w:before="20" w:after="40" w:line="276" w:lineRule="auto"/>
+            </w:pPr>
+            <w:r>
+              <w:rPr>
+                <w:rFonts w:ascii="Arial" w:hAnsi="Arial"/>
+                <w:b/>
+                <w:color w:val="166534"/>
+                <w:sz w:val="19"/>
+              </w:rPr>
+              <w:t>• 🟢 TOP AM DẪN ĐẦU DOANH THU KINH DOANH:</w:t>
+            </w:r>
+          </w:p>
+          <w:p>
+            <w:pPr>
+              <w:spacing w:before="20" w:after="40" w:line="276" w:lineRule="auto"/>
+            </w:pPr>
+            <w:r>
+              <w:rPr>
+                <w:rFonts w:ascii="Arial" w:hAnsi="Arial"/>
+                <w:color w:val="334155"/>
+                <w:sz w:val="19"/>
+              </w:rPr>
+              <w:t xml:space="preserve">  1. Phan Đình Duy (Khánh Hòa): 478,97 Triệu VNĐ (10.088 đơn | chiếm tới 44,2% tổng doanh thu toàn vùng, tăng +3,24 Tr ₫ WoW).</w:t>
+            </w:r>
+          </w:p>
+          <w:p>
+            <w:pPr>
+              <w:spacing w:before="20" w:after="40" w:line="276" w:lineRule="auto"/>
+            </w:pPr>
+            <w:r>
+              <w:rPr>
+                <w:rFonts w:ascii="Arial" w:hAnsi="Arial"/>
+                <w:color w:val="334155"/>
+                <w:sz w:val="19"/>
+              </w:rPr>
+              <w:t xml:space="preserve">  2. Thái Thị Thanh Thư (Khánh Hòa): 98,94 Triệu VNĐ (4.608 đơn | chiếm 9,1%, giảm -11,77 Tr ₫ / -10,6%).</w:t>
+            </w:r>
+          </w:p>
+          <w:p>
+            <w:pPr>
+              <w:spacing w:before="20" w:after="40" w:line="276" w:lineRule="auto"/>
+            </w:pPr>
+            <w:r>
+              <w:rPr>
+                <w:rFonts w:ascii="Arial" w:hAnsi="Arial"/>
+                <w:color w:val="334155"/>
+                <w:sz w:val="19"/>
+              </w:rPr>
+              <w:t xml:space="preserve">  3. Nguyễn Duy Long (Ninh Thuận): 98,17 Triệu VNĐ (3.651 đơn | chiếm 9,1%, tăng +2,17 Tr ₫ / +2,3%).</w:t>
+            </w:r>
+          </w:p>
+          <w:p>
+            <w:pPr>
+              <w:spacing w:before="20" w:after="40" w:line="276" w:lineRule="auto"/>
+            </w:pPr>
+            <w:r>
+              <w:rPr>
+                <w:rFonts w:ascii="Arial" w:hAnsi="Arial"/>
+                <w:color w:val="334155"/>
+                <w:sz w:val="19"/>
+              </w:rPr>
+              <w:t xml:space="preserve">  4. Lê Thanh Nhựt (Bình Thuận): 60,88 Triệu VNĐ (2.279 đơn | chiếm 5,6%, tăng +3,78 Tr ₫ / +6,6%).</w:t>
+            </w:r>
+          </w:p>
+          <w:p>
+            <w:pPr>
+              <w:spacing w:before="20" w:after="40" w:line="276" w:lineRule="auto"/>
+            </w:pPr>
+            <w:r>
+              <w:rPr>
+                <w:rFonts w:ascii="Arial" w:hAnsi="Arial"/>
+                <w:color w:val="334155"/>
+                <w:sz w:val="19"/>
+              </w:rPr>
+              <w:t xml:space="preserve">  5. Huỳnh Thúc Duân (Đắk Nông): 57,07 Triệu VNĐ (4.041 đơn | chiếm 5,3%, giảm -23,44 Tr ₫ / -29,1%, hụt -1.608 đơn).</w:t>
+            </w:r>
+          </w:p>
+          <w:p>
+            <w:pPr>
+              <w:spacing w:before="20" w:after="40" w:line="276" w:lineRule="auto"/>
+            </w:pPr>
+            <w:r>
+              <w:rPr>
+                <w:rFonts w:ascii="Arial" w:hAnsi="Arial"/>
+                <w:color w:val="334155"/>
+                <w:sz w:val="19"/>
+              </w:rPr>
+              <w:t xml:space="preserve">  6. Hồng Bích Nga (Lâm Đồng): 47,86 Triệu VNĐ (1.771 đơn | chiếm 4,4%, giảm -7,07 Tr ₫ / -12,9%).</w:t>
+            </w:r>
+          </w:p>
+          <w:p>
+            <w:pPr>
+              <w:spacing w:before="20" w:after="40" w:line="276" w:lineRule="auto"/>
+            </w:pPr>
+            <w:r>
+              <w:rPr>
+                <w:rFonts w:ascii="Arial" w:hAnsi="Arial"/>
+                <w:color w:val="334155"/>
+                <w:sz w:val="19"/>
+              </w:rPr>
+              <w:t xml:space="preserve">  7. Huỳnh Thị Kim Chi (Lâm Đồng): 32,13 Triệu VNĐ (690 đơn | chiếm 3,0%, giảm -2,35 Tr ₫).</w:t>
+            </w:r>
+          </w:p>
+          <w:p>
+            <w:pPr>
+              <w:spacing w:before="20" w:after="40" w:line="276" w:lineRule="auto"/>
+            </w:pPr>
+            <w:r>
+              <w:rPr>
+                <w:rFonts w:ascii="Arial" w:hAnsi="Arial"/>
+                <w:color w:val="334155"/>
+                <w:sz w:val="19"/>
+              </w:rPr>
+              <w:t xml:space="preserve">  8. Trần Thị Nhung (Đắk Nông): 29,32 Triệu VNĐ (878 đơn | chiếm 2,7%, giảm -8,04 Tr ₫ / -21,5%).</w:t>
+            </w:r>
+          </w:p>
+          <w:p>
+            <w:pPr>
+              <w:spacing w:before="20" w:after="40" w:line="276" w:lineRule="auto"/>
+            </w:pPr>
+            <w:r>
+              <w:rPr>
+                <w:rFonts w:ascii="Arial" w:hAnsi="Arial"/>
+                <w:color w:val="334155"/>
+                <w:sz w:val="19"/>
+              </w:rPr>
+              <w:t xml:space="preserve">  9. Nguyễn Đỗ Minh Nghĩa (Lâm Đồng): 27,92 Triệu VNĐ (1.143 đơn | chiếm 2,6%).</w:t>
+            </w:r>
+          </w:p>
+          <w:p>
+            <w:pPr>
+              <w:spacing w:before="20" w:after="40" w:line="276" w:lineRule="auto"/>
+            </w:pPr>
+            <w:r>
+              <w:rPr>
+                <w:rFonts w:ascii="Arial" w:hAnsi="Arial"/>
+                <w:color w:val="334155"/>
+                <w:sz w:val="19"/>
+              </w:rPr>
+              <w:t xml:space="preserve">  10. Nguyễn Lê Nguyên Vũ (Lâm Đồng): 25,44 Triệu VNĐ (1.058 đơn | chiếm 2,3%, tăng +2,48 Tr ₫).</w:t>
+            </w:r>
+          </w:p>
+          <w:p>
+            <w:pPr>
+              <w:spacing w:before="20" w:after="40" w:line="276" w:lineRule="auto"/>
+            </w:pPr>
+            <w:r>
+              <w:rPr>
+                <w:rFonts w:ascii="Arial" w:hAnsi="Arial"/>
+                <w:color w:val="334155"/>
+                <w:sz w:val="19"/>
+              </w:rPr>
+              <w:t xml:space="preserve">  11. Nguyễn Hoàng Phi (Khánh Hòa): 25,01 Triệu VNĐ (798 đơn | chiếm 2,3%).</w:t>
+            </w:r>
+          </w:p>
+          <w:p>
+            <w:pPr>
+              <w:spacing w:before="20" w:after="40" w:line="276" w:lineRule="auto"/>
+            </w:pPr>
+            <w:r>
+              <w:rPr>
+                <w:rFonts w:ascii="Arial" w:hAnsi="Arial"/>
+                <w:color w:val="334155"/>
+                <w:sz w:val="19"/>
+              </w:rPr>
+              <w:t xml:space="preserve">  12. Lê Văn Trường (Lâm Đồng): 23,86 Triệu VNĐ (1.115 đơn | chiếm 2,2%, giảm -3,55 Tr ₫).</w:t>
+            </w:r>
+          </w:p>
+          <w:p>
+            <w:pPr>
+              <w:spacing w:before="20" w:after="40" w:line="276" w:lineRule="auto"/>
+            </w:pPr>
+            <w:r>
+              <w:rPr>
+                <w:rFonts w:ascii="Arial" w:hAnsi="Arial"/>
+                <w:color w:val="334155"/>
+                <w:sz w:val="19"/>
+              </w:rPr>
+              <w:t xml:space="preserve">  13. Cao Thị Thanh Thủy (Khánh Hòa): 19,83 Triệu VNĐ (633 đơn | chiếm 1,8%, tăng +2,91 Tr ₫ / +17,2%).</w:t>
+            </w:r>
+          </w:p>
+          <w:p>
+            <w:pPr>
+              <w:spacing w:before="20" w:after="40" w:line="276" w:lineRule="auto"/>
+            </w:pPr>
+            <w:r>
+              <w:rPr>
+                <w:rFonts w:ascii="Arial" w:hAnsi="Arial"/>
+                <w:color w:val="334155"/>
+                <w:sz w:val="19"/>
+              </w:rPr>
+              <w:t xml:space="preserve">  14. Nguyễn Ngọc Khánh (Bình Thuận): 17,38 Triệu VNĐ (468 đơn | chiếm 1,6%, bứt phá +4,69 Tr ₫ / +36,9%).</w:t>
+            </w:r>
+          </w:p>
+          <w:p>
+            <w:pPr>
+              <w:spacing w:before="20" w:after="40" w:line="276" w:lineRule="auto"/>
+            </w:pPr>
+            <w:r>
+              <w:rPr>
+                <w:rFonts w:ascii="Arial" w:hAnsi="Arial"/>
+                <w:color w:val="334155"/>
+                <w:sz w:val="19"/>
+              </w:rPr>
+              <w:t xml:space="preserve">  15. Nguyễn Thanh Long (Khánh Hòa): 13,08 Triệu VNĐ (312 đơn | chiếm 1,2%, tăng +2,50 Tr ₫ / +23,7%).</w:t>
+            </w:r>
+          </w:p>
+          <w:p>
+            <w:pPr>
+              <w:spacing w:before="20" w:after="40" w:line="276" w:lineRule="auto"/>
+            </w:pPr>
+            <w:r>
+              <w:rPr>
+                <w:rFonts w:ascii="Arial" w:hAnsi="Arial"/>
+                <w:color w:val="334155"/>
+                <w:sz w:val="19"/>
+              </w:rPr>
+              <w:t xml:space="preserve">  16. Nguyễn Thị Tuyết Thơ (Lâm Đồng): 12,50 Triệu VNĐ (287 đơn | chiếm 1,2%, giảm -4,94 Tr ₫ / -28,3%).</w:t>
+            </w:r>
+          </w:p>
+          <w:p>
+            <w:pPr>
+              <w:spacing w:before="20" w:after="40" w:line="276" w:lineRule="auto"/>
+            </w:pPr>
+            <w:r>
+              <w:rPr>
+                <w:rFonts w:ascii="Arial" w:hAnsi="Arial"/>
+                <w:color w:val="334155"/>
+                <w:sz w:val="19"/>
+              </w:rPr>
+            </w:r>
+          </w:p>
+          <w:p>
+            <w:pPr>
+              <w:spacing w:before="20" w:after="40" w:line="276" w:lineRule="auto"/>
+            </w:pPr>
+            <w:r>
+              <w:rPr>
+                <w:rFonts w:ascii="Arial" w:hAnsi="Arial"/>
+                <w:b/>
+                <w:color w:val="0F172A"/>
+                <w:sz w:val="20"/>
+              </w:rPr>
+              <w:t>📍 3. BẢNG 3: TOP 5 AM CÓ MỨC GIẢM DOANH THU CẦN TẬP TRUNG HỖ TRỢ (TOP DROP):</w:t>
+            </w:r>
+          </w:p>
+          <w:p>
+            <w:pPr>
+              <w:spacing w:before="20" w:after="40" w:line="276" w:lineRule="auto"/>
+            </w:pPr>
+            <w:r>
+              <w:rPr>
+                <w:rFonts w:ascii="Arial" w:hAnsi="Arial"/>
+                <w:color w:val="334155"/>
+                <w:sz w:val="19"/>
+              </w:rPr>
+              <w:t>• 1. Huỳnh Thúc Duân: Giảm -23,44 Tr ₫ (-29,1% | từ 80,5 Tr xuống 57,1 Tr ₫, hụt 1.608 đơn).</w:t>
+            </w:r>
+          </w:p>
+          <w:p>
+            <w:pPr>
+              <w:spacing w:before="20" w:after="40" w:line="276" w:lineRule="auto"/>
+            </w:pPr>
+            <w:r>
+              <w:rPr>
+                <w:rFonts w:ascii="Arial" w:hAnsi="Arial"/>
+                <w:color w:val="334155"/>
+                <w:sz w:val="19"/>
+              </w:rPr>
+              <w:t>• 2. Thái Thị Thanh Thư: Giảm -11,77 Tr ₫ (-10,6% | từ 110,7 Tr xuống 98,9 Tr ₫, hụt 233 đơn).</w:t>
+            </w:r>
+          </w:p>
+          <w:p>
+            <w:pPr>
+              <w:spacing w:before="20" w:after="40" w:line="276" w:lineRule="auto"/>
+            </w:pPr>
+            <w:r>
+              <w:rPr>
+                <w:rFonts w:ascii="Arial" w:hAnsi="Arial"/>
+                <w:color w:val="334155"/>
+                <w:sz w:val="19"/>
+              </w:rPr>
+              <w:t>• 3. Trần Thị Nhung: Giảm -8,04 Tr ₫ (-21,5% | từ 37,4 Tr xuống 29,3 Tr ₫, hụt 329 đơn).</w:t>
+            </w:r>
+          </w:p>
+          <w:p>
+            <w:pPr>
+              <w:spacing w:before="20" w:after="40" w:line="276" w:lineRule="auto"/>
+            </w:pPr>
+            <w:r>
+              <w:rPr>
+                <w:rFonts w:ascii="Arial" w:hAnsi="Arial"/>
+                <w:color w:val="334155"/>
+                <w:sz w:val="19"/>
+              </w:rPr>
+              <w:t>• 4. Hồng Bích Nga: Giảm -7,07 Tr ₫ (-12,9% | từ 54,9 Tr xuống 47,9 Tr ₫, hụt 93 đơn).</w:t>
+            </w:r>
+          </w:p>
+          <w:p>
+            <w:pPr>
+              <w:spacing w:before="20" w:after="40" w:line="276" w:lineRule="auto"/>
+            </w:pPr>
+            <w:r>
+              <w:rPr>
+                <w:rFonts w:ascii="Arial" w:hAnsi="Arial"/>
+                <w:color w:val="334155"/>
+                <w:sz w:val="19"/>
+              </w:rPr>
+              <w:t>• 5. Nguyễn Thị Tuyết Thơ: Giảm -4,94 Tr ₫ (-28,3% | từ 17,4 Tr xuống 12,5 Tr ₫, hụt 44 đơn).</w:t>
+            </w:r>
+          </w:p>
+          <w:p>
+            <w:pPr>
+              <w:spacing w:before="20" w:after="40" w:line="276" w:lineRule="auto"/>
+            </w:pPr>
+            <w:r>
+              <w:rPr>
+                <w:rFonts w:ascii="Arial" w:hAnsi="Arial"/>
+                <w:color w:val="334155"/>
+                <w:sz w:val="19"/>
+              </w:rPr>
+            </w:r>
+          </w:p>
+          <w:p>
+            <w:pPr>
+              <w:spacing w:before="20" w:after="40" w:line="276" w:lineRule="auto"/>
+            </w:pPr>
+            <w:r>
+              <w:rPr>
+                <w:rFonts w:ascii="Arial" w:hAnsi="Arial"/>
+                <w:b/>
+                <w:color w:val="0F172A"/>
+                <w:sz w:val="20"/>
+              </w:rPr>
+              <w:t>📍 4. BẢNG 4: KẾT QUẢ PHÁT TRIỂN KHÁCH HÀNG MỚI F30:</w:t>
+            </w:r>
+          </w:p>
+          <w:p>
+            <w:pPr>
+              <w:spacing w:before="20" w:after="40" w:line="276" w:lineRule="auto"/>
+            </w:pPr>
+            <w:r>
+              <w:rPr>
+                <w:rFonts w:ascii="Arial" w:hAnsi="Arial"/>
+                <w:color w:val="334155"/>
+                <w:sz w:val="19"/>
+              </w:rPr>
+              <w:t>• Dẫn đầu toàn vùng về số lượng shop mới:</w:t>
+            </w:r>
+          </w:p>
+          <w:p>
+            <w:pPr>
+              <w:spacing w:before="20" w:after="40" w:line="276" w:lineRule="auto"/>
+            </w:pPr>
+            <w:r>
+              <w:rPr>
+                <w:rFonts w:ascii="Arial" w:hAnsi="Arial"/>
+                <w:color w:val="334155"/>
+                <w:sz w:val="19"/>
+              </w:rPr>
+              <w:t xml:space="preserve">  - AM Phan Đình Duy: 16 shop mới (doanh thu 1,21 Tr ₫).</w:t>
+            </w:r>
+          </w:p>
+          <w:p>
+            <w:pPr>
+              <w:spacing w:before="20" w:after="40" w:line="276" w:lineRule="auto"/>
+            </w:pPr>
+            <w:r>
+              <w:rPr>
+                <w:rFonts w:ascii="Arial" w:hAnsi="Arial"/>
+                <w:color w:val="334155"/>
+                <w:sz w:val="19"/>
+              </w:rPr>
+              <w:t xml:space="preserve">  - AM Thái Thị Thanh Thư: 15 shop mới (doanh thu 630 ngàn ₫).</w:t>
+            </w:r>
+          </w:p>
+          <w:p>
+            <w:pPr>
+              <w:spacing w:before="20" w:after="40" w:line="276" w:lineRule="auto"/>
+            </w:pPr>
+            <w:r>
+              <w:rPr>
+                <w:rFonts w:ascii="Arial" w:hAnsi="Arial"/>
+                <w:color w:val="334155"/>
+                <w:sz w:val="19"/>
+              </w:rPr>
+              <w:t xml:space="preserve">  - AM Nguyễn Duy Long: 13 shop mới (doanh thu 677 ngàn ₫).</w:t>
+            </w:r>
+          </w:p>
+          <w:p>
+            <w:pPr>
+              <w:spacing w:before="20" w:after="40" w:line="276" w:lineRule="auto"/>
+            </w:pPr>
+            <w:r>
+              <w:rPr>
+                <w:rFonts w:ascii="Arial" w:hAnsi="Arial"/>
+                <w:color w:val="334155"/>
+                <w:sz w:val="19"/>
+              </w:rPr>
+              <w:t xml:space="preserve">  - AM Trần Thị Nhung: 9 shop mới (doanh thu 643 ngàn ₫).</w:t>
+            </w:r>
+          </w:p>
+          <w:p>
+            <w:pPr>
+              <w:spacing w:before="20" w:after="40" w:line="276" w:lineRule="auto"/>
+            </w:pPr>
+            <w:r>
+              <w:rPr>
+                <w:rFonts w:ascii="Arial" w:hAnsi="Arial"/>
+                <w:color w:val="334155"/>
+                <w:sz w:val="19"/>
+              </w:rPr>
+              <w:t xml:space="preserve">  - AM Huỳnh Thị Kim Chi: 6 shop mới (doanh thu 335 ngàn ₫).</w:t>
+            </w:r>
+          </w:p>
+          <w:p>
+            <w:pPr>
+              <w:spacing w:before="20" w:after="40" w:line="276" w:lineRule="auto"/>
+            </w:pPr>
+            <w:r>
+              <w:rPr>
+                <w:rFonts w:ascii="Arial" w:hAnsi="Arial"/>
+                <w:color w:val="334155"/>
+                <w:sz w:val="19"/>
+              </w:rPr>
+              <w:t xml:space="preserve">  - AM Hồng Bích Nga: 6 shop mới (doanh thu 207 ngàn ₫).</w:t>
+            </w:r>
+          </w:p>
+          <w:p>
+            <w:pPr>
+              <w:spacing w:before="20" w:after="40" w:line="276" w:lineRule="auto"/>
+            </w:pPr>
+            <w:r>
+              <w:rPr>
+                <w:rFonts w:ascii="Arial" w:hAnsi="Arial"/>
+                <w:color w:val="334155"/>
+                <w:sz w:val="19"/>
+              </w:rPr>
+              <w:t xml:space="preserve">  - AM Lê Thanh Nhựt: 5 shop mới (doanh thu 674 ngàn ₫).</w:t>
+            </w:r>
+          </w:p>
+          <w:p>
+            <w:pPr>
+              <w:spacing w:before="20" w:after="40" w:line="276" w:lineRule="auto"/>
+            </w:pPr>
+            <w:r>
+              <w:rPr>
+                <w:rFonts w:ascii="Arial" w:hAnsi="Arial"/>
+                <w:color w:val="334155"/>
+                <w:sz w:val="19"/>
+              </w:rPr>
+              <w:t xml:space="preserve">  - AM Nguyễn Ngọc Khánh: 5 shop mới (doanh thu bứt phá 2,88 Tr ₫).</w:t>
+            </w:r>
+          </w:p>
+          <w:p>
+            <w:pPr>
+              <w:spacing w:before="20" w:after="40" w:line="276" w:lineRule="auto"/>
+            </w:pPr>
+            <w:r>
+              <w:rPr>
+                <w:rFonts w:ascii="Arial" w:hAnsi="Arial"/>
+                <w:color w:val="334155"/>
+                <w:sz w:val="19"/>
+              </w:rPr>
+            </w:r>
+          </w:p>
+          <w:p>
+            <w:pPr>
+              <w:spacing w:before="20" w:after="40" w:line="276" w:lineRule="auto"/>
+            </w:pPr>
+            <w:r>
+              <w:rPr>
+                <w:rFonts w:ascii="Arial" w:hAnsi="Arial"/>
+                <w:b/>
+                <w:color w:val="0F172A"/>
+                <w:sz w:val="20"/>
+              </w:rPr>
+              <w:t>📍 5. BẢNG 5: DANH SÁCH SHOP NHÓM A CẢNH BÁO SỤT GIẢM SẢN LƯỢNG / NGUY CƠ RỜI BỎ:</w:t>
+            </w:r>
+          </w:p>
+          <w:p>
+            <w:pPr>
+              <w:spacing w:before="20" w:after="40" w:line="276" w:lineRule="auto"/>
+            </w:pPr>
+            <w:r>
+              <w:rPr>
+                <w:rFonts w:ascii="Arial" w:hAnsi="Arial"/>
+                <w:color w:val="334155"/>
+                <w:sz w:val="19"/>
+              </w:rPr>
+              <w:t>• 1. Shop Nghĩa Gumi (AM Duân - BC Bắc Gia Nghĩa): Giảm từ 167 đơn xuống 31 đơn (-136 đơn / -81,4%).</w:t>
+            </w:r>
+          </w:p>
+          <w:p>
+            <w:pPr>
+              <w:spacing w:before="20" w:after="40" w:line="276" w:lineRule="auto"/>
+            </w:pPr>
+            <w:r>
+              <w:rPr>
+                <w:rFonts w:ascii="Arial" w:hAnsi="Arial"/>
+                <w:color w:val="334155"/>
+                <w:sz w:val="19"/>
+              </w:rPr>
+              <w:t>• 2. Bếp vườn nhà Trinh (AM Duy - BC Vạn Ninh): Giảm -48,6% sv W-1 (-35 Tr ₫), MTD đạt 730 Tr (mới đạt 51,2% sv M-1), tỷ lệ trụ hạng 31,4%.</w:t>
+            </w:r>
+          </w:p>
+          <w:p>
+            <w:pPr>
+              <w:spacing w:before="20" w:after="40" w:line="276" w:lineRule="auto"/>
+            </w:pPr>
+            <w:r>
+              <w:rPr>
+                <w:rFonts w:ascii="Arial" w:hAnsi="Arial"/>
+                <w:color w:val="334155"/>
+                <w:sz w:val="19"/>
+              </w:rPr>
+              <w:t>• 3. Cám store (AM Nga - BC B'Lao): Giảm -29,6% sv W-1 (-29 Tr ₫), MTD 929 Tr, tỷ lệ trụ hạng 40,2%.</w:t>
+            </w:r>
+          </w:p>
+          <w:p>
+            <w:pPr>
+              <w:spacing w:before="20" w:after="40" w:line="276" w:lineRule="auto"/>
+            </w:pPr>
+            <w:r>
+              <w:rPr>
+                <w:rFonts w:ascii="Arial" w:hAnsi="Arial"/>
+                <w:color w:val="334155"/>
+                <w:sz w:val="19"/>
+              </w:rPr>
+              <w:t>• 4. Vận Chuyển Online (AM Duy - BC Nha Trang): Giảm -202 đơn (-14,7% sv W-1 | từ 1.378 xuống 1.176 đơn).</w:t>
+            </w:r>
+          </w:p>
+          <w:p>
+            <w:pPr>
+              <w:spacing w:before="20" w:after="40" w:line="276" w:lineRule="auto"/>
+            </w:pPr>
+            <w:r>
+              <w:rPr>
+                <w:rFonts w:ascii="Arial" w:hAnsi="Arial"/>
+                <w:color w:val="334155"/>
+                <w:sz w:val="19"/>
+              </w:rPr>
+              <w:t>• 5. Công Ty TNHH Khởi Phát Thịnh (AM Thư - BC Nam Nha Trang 3): Giảm -60 đơn (-12,1% | từ 497 xuống 437 đơn).</w:t>
+            </w:r>
+          </w:p>
+          <w:p>
+            <w:pPr>
+              <w:spacing w:before="20" w:after="40" w:line="276" w:lineRule="auto"/>
+            </w:pPr>
+            <w:r>
+              <w:rPr>
+                <w:rFonts w:ascii="Arial" w:hAnsi="Arial"/>
+                <w:color w:val="334155"/>
+                <w:sz w:val="19"/>
+              </w:rPr>
+              <w:t>• 6. Shop Đồ Bộ (AM Duân - BC Bắc Gia Nghĩa): Giảm từ 53 đơn xuống 33 đơn (-20 đơn / -37,7%).</w:t>
+            </w:r>
+          </w:p>
+          <w:p>
+            <w:pPr>
+              <w:spacing w:before="20" w:after="40" w:line="276" w:lineRule="auto"/>
+            </w:pPr>
+            <w:r>
+              <w:rPr>
+                <w:rFonts w:ascii="Arial" w:hAnsi="Arial"/>
+                <w:color w:val="334155"/>
+                <w:sz w:val="19"/>
+              </w:rPr>
+              <w:t>• 7. Shop Hằng Huyền (AM Thư - BC Nam Nha Trang 1): Giảm từ 28 đơn xuống 1 đơn (-27 đơn / -96,4%).</w:t>
+            </w:r>
+          </w:p>
+          <w:p>
+            <w:pPr>
+              <w:spacing w:before="20" w:after="40" w:line="276" w:lineRule="auto"/>
+            </w:pPr>
+            <w:r>
+              <w:rPr>
+                <w:rFonts w:ascii="Arial" w:hAnsi="Arial"/>
+                <w:color w:val="334155"/>
+                <w:sz w:val="19"/>
+              </w:rPr>
+              <w:t>• 8. TIÊN HUỲNH US (AM Long - BC Phước Dinh): Giảm từ 105 đơn xuống 88 đơn (-17 đơn / -16,2%).</w:t>
+            </w:r>
+          </w:p>
+          <w:p>
+            <w:pPr>
+              <w:spacing w:before="20" w:after="40" w:line="276" w:lineRule="auto"/>
+            </w:pPr>
+            <w:r>
+              <w:rPr>
+                <w:rFonts w:ascii="Arial" w:hAnsi="Arial"/>
+                <w:color w:val="334155"/>
+                <w:sz w:val="19"/>
+              </w:rPr>
+              <w:t>• 9. VA Beauty Queen79 (AM Nhung - BC Đức Lập): Giảm từ 23 đơn xuống 7 đơn (-16 đơn / -69,6%).</w:t>
             </w:r>
           </w:p>
           <w:p>
@@ -9109,85 +9713,303 @@
                 <w:color w:val="0F172A"/>
                 <w:sz w:val="19"/>
               </w:rPr>
-              <w:t>"Kính thưa Ban Giám Đốc, chuyển sang Tab 15 là bức tranh Kinh doanh và phát triển khách hàng mới F30:</w:t>
-            </w:r>
-          </w:p>
-          <w:p>
-            <w:pPr>
-              <w:spacing w:before="20" w:after="40" w:line="276" w:lineRule="auto"/>
-            </w:pPr>
-            <w:r>
-              <w:rPr>
-                <w:rFonts w:ascii="Arial" w:hAnsi="Arial"/>
-                <w:color w:val="334155"/>
-                <w:sz w:val="19"/>
-              </w:rPr>
-              <w:t>Khâu kinh doanh và vận hành luôn gắn bó chặt chẽ với nhau. Khi chất lượng vận hành tốt thì việc giữ chân và mở rộng khách hàng sẽ rất thuận lợi.</w:t>
-            </w:r>
-          </w:p>
-          <w:p>
-            <w:pPr>
-              <w:spacing w:before="20" w:after="40" w:line="276" w:lineRule="auto"/>
-            </w:pPr>
-            <w:r>
-              <w:rPr>
-                <w:rFonts w:ascii="Arial" w:hAnsi="Arial"/>
-                <w:color w:val="334155"/>
-                <w:sz w:val="19"/>
-              </w:rPr>
-              <w:t>Tuần này, anh Phan Đình Duy ở Nha Trang và anh Duy Long ở Ninh Thuận tiếp tục duy trì doanh thu hàng đầu vùng.</w:t>
-            </w:r>
-          </w:p>
-          <w:p>
-            <w:pPr>
-              <w:spacing w:before="20" w:after="40" w:line="276" w:lineRule="auto"/>
-            </w:pPr>
-            <w:r>
-              <w:rPr>
-                <w:rFonts w:ascii="Arial" w:hAnsi="Arial"/>
-                <w:color w:val="334155"/>
-                <w:sz w:val="19"/>
-              </w:rPr>
-              <w:t>Bên cạnh đó, có 2 khu vực chúng ta cần quan tâm hỗ trợ thêm về mặt kinh doanh:</w:t>
-            </w:r>
-          </w:p>
-          <w:p>
-            <w:pPr>
-              <w:spacing w:before="20" w:after="40" w:line="276" w:lineRule="auto"/>
-            </w:pPr>
-            <w:r>
-              <w:rPr>
-                <w:rFonts w:ascii="Arial" w:hAnsi="Arial"/>
-                <w:color w:val="334155"/>
-                <w:sz w:val="19"/>
-              </w:rPr>
-              <w:t>Tại cụm anh Duân ở Đắk Nông: Sản lượng giảm khoảng 1.600 đơn tại Gia Nghĩa và Nhân Cơ.</w:t>
-            </w:r>
-          </w:p>
-          <w:p>
-            <w:pPr>
-              <w:spacing w:before="20" w:after="40" w:line="276" w:lineRule="auto"/>
-            </w:pPr>
-            <w:r>
-              <w:rPr>
-                <w:rFonts w:ascii="Arial" w:hAnsi="Arial"/>
-                <w:color w:val="334155"/>
-                <w:sz w:val="19"/>
-              </w:rPr>
-              <w:t>Tại cụm chị Thư ở Nha Trang: Hụt khoảng 7.600 đơn.</w:t>
-            </w:r>
-          </w:p>
-          <w:p>
-            <w:pPr>
-              <w:spacing w:before="20" w:after="40" w:line="276" w:lineRule="auto"/>
-            </w:pPr>
-            <w:r>
-              <w:rPr>
-                <w:rFonts w:ascii="Arial" w:hAnsi="Arial"/>
-                <w:color w:val="334155"/>
-                <w:sz w:val="19"/>
-              </w:rPr>
-              <w:t>Đề nghị anh Duân và chị Thư cùng đội ngũ Sales chủ động gặp gỡ các chủ shop nhóm A để lắng nghe ý kiến phản hồi về chất lượng lấy giao, từ đó đưa ra các cam kết hỗ trợ phù hợp nhằm phục hồi sản lượng trong các tuần tiếp theo.</w:t>
+              <w:t>"Kính thưa Ban Giám Đốc và các anh chị AM, chuyển sang Tab 15 là bức tranh Kinh doanh và phát triển khách hàng mới F30:</w:t>
+            </w:r>
+          </w:p>
+          <w:p>
+            <w:pPr>
+              <w:spacing w:before="20" w:after="40" w:line="276" w:lineRule="auto"/>
+            </w:pPr>
+            <w:r>
+              <w:rPr>
+                <w:rFonts w:ascii="Arial" w:hAnsi="Arial"/>
+                <w:color w:val="334155"/>
+                <w:sz w:val="19"/>
+              </w:rPr>
+              <w:t>Khâu kinh doanh và vận hành luôn gắn bó mật thiết với nhau: Khi chất lượng giao vận hành thông suốt thì việc giữ chân và mở rộng khách hàng của đội ngũ Sales sẽ trở nên rất thuận lợi.</w:t>
+            </w:r>
+          </w:p>
+          <w:p>
+            <w:pPr>
+              <w:spacing w:before="20" w:after="40" w:line="276" w:lineRule="auto"/>
+            </w:pPr>
+            <w:r>
+              <w:rPr>
+                <w:rFonts w:ascii="Arial" w:hAnsi="Arial"/>
+                <w:color w:val="334155"/>
+                <w:sz w:val="19"/>
+              </w:rPr>
+            </w:r>
+          </w:p>
+          <w:p>
+            <w:pPr>
+              <w:spacing w:before="20" w:after="40" w:line="276" w:lineRule="auto"/>
+            </w:pPr>
+            <w:r>
+              <w:rPr>
+                <w:rFonts w:ascii="Arial" w:hAnsi="Arial"/>
+                <w:color w:val="334155"/>
+                <w:sz w:val="19"/>
+              </w:rPr>
+              <w:t>Nhìn vào tổng quan tuần W40:</w:t>
+            </w:r>
+          </w:p>
+          <w:p>
+            <w:pPr>
+              <w:spacing w:before="20" w:after="40" w:line="276" w:lineRule="auto"/>
+            </w:pPr>
+            <w:r>
+              <w:rPr>
+                <w:rFonts w:ascii="Arial" w:hAnsi="Arial"/>
+                <w:color w:val="334155"/>
+                <w:sz w:val="19"/>
+              </w:rPr>
+              <w:t>Toàn vùng Nam Trung Bộ đạt doanh thu kinh doanh 1.084,3 triệu đồng với 34.412 đơn hàng. So với tuần trước, doanh thu giảm nhẹ 3,9% (giảm 43,6 triệu đồng).</w:t>
+            </w:r>
+          </w:p>
+          <w:p>
+            <w:pPr>
+              <w:spacing w:before="20" w:after="40" w:line="276" w:lineRule="auto"/>
+            </w:pPr>
+            <w:r>
+              <w:rPr>
+                <w:rFonts w:ascii="Arial" w:hAnsi="Arial"/>
+                <w:color w:val="334155"/>
+                <w:sz w:val="19"/>
+              </w:rPr>
+              <w:t>Về phía các AM:</w:t>
+            </w:r>
+          </w:p>
+          <w:p>
+            <w:pPr>
+              <w:spacing w:before="20" w:after="40" w:line="276" w:lineRule="auto"/>
+            </w:pPr>
+            <w:r>
+              <w:rPr>
+                <w:rFonts w:ascii="Arial" w:hAnsi="Arial"/>
+                <w:color w:val="334155"/>
+                <w:sz w:val="19"/>
+              </w:rPr>
+              <w:t>- Điểm sáng rất lớn là anh Phan Đình Duy ở Khánh Hòa: Tiếp tục là ngọn cờ đầu của vùng với 478,97 triệu đồng doanh thu, chiếm tới 44,2% tổng doanh thu toàn vùng, đạt hơn 10.000 đơn và vẫn duy trì mức tăng trưởng dương (+3,24 triệu đồng WoW).</w:t>
+            </w:r>
+          </w:p>
+          <w:p>
+            <w:pPr>
+              <w:spacing w:before="20" w:after="40" w:line="276" w:lineRule="auto"/>
+            </w:pPr>
+            <w:r>
+              <w:rPr>
+                <w:rFonts w:ascii="Arial" w:hAnsi="Arial"/>
+                <w:color w:val="334155"/>
+                <w:sz w:val="19"/>
+              </w:rPr>
+              <w:t>- Kế đến là chị Thái Thị Thanh Thư (98,9 triệu đồng) và anh Nguyễn Duy Long ở Ninh Thuận (98,2 triệu đồng, tăng +2,17 triệu đồng).</w:t>
+            </w:r>
+          </w:p>
+          <w:p>
+            <w:pPr>
+              <w:spacing w:before="20" w:after="40" w:line="276" w:lineRule="auto"/>
+            </w:pPr>
+            <w:r>
+              <w:rPr>
+                <w:rFonts w:ascii="Arial" w:hAnsi="Arial"/>
+                <w:color w:val="334155"/>
+                <w:sz w:val="19"/>
+              </w:rPr>
+              <w:t>- Anh Lê Thanh Nhựt ở Bình Thuận cũng tăng trưởng tốt, đạt 60,88 triệu đồng (+3,78 triệu đồng); anh Nguyễn Ngọc Khánh có bước bứt phá doanh thu rất ấn tượng tăng +36,9%, đạt 17,38 triệu đồng.</w:t>
+            </w:r>
+          </w:p>
+          <w:p>
+            <w:pPr>
+              <w:spacing w:before="20" w:after="40" w:line="276" w:lineRule="auto"/>
+            </w:pPr>
+            <w:r>
+              <w:rPr>
+                <w:rFonts w:ascii="Arial" w:hAnsi="Arial"/>
+                <w:color w:val="334155"/>
+                <w:sz w:val="19"/>
+              </w:rPr>
+            </w:r>
+          </w:p>
+          <w:p>
+            <w:pPr>
+              <w:spacing w:before="20" w:after="40" w:line="276" w:lineRule="auto"/>
+            </w:pPr>
+            <w:r>
+              <w:rPr>
+                <w:rFonts w:ascii="Arial" w:hAnsi="Arial"/>
+                <w:color w:val="334155"/>
+                <w:sz w:val="19"/>
+              </w:rPr>
+              <w:t>Một điểm sáng rất đáng ghi nhận nữa là công tác phát triển khách hàng mới F30:</w:t>
+            </w:r>
+          </w:p>
+          <w:p>
+            <w:pPr>
+              <w:spacing w:before="20" w:after="40" w:line="276" w:lineRule="auto"/>
+            </w:pPr>
+            <w:r>
+              <w:rPr>
+                <w:rFonts w:ascii="Arial" w:hAnsi="Arial"/>
+                <w:color w:val="334155"/>
+                <w:sz w:val="19"/>
+              </w:rPr>
+              <w:t>Tuần này toàn vùng đã phát triển được 111 shop mới (tăng 19 shop so với 92 shop của tuần trước, tức tăng 20,7%). Doanh thu từ shop mới tăng vọt 40,5%, mang về 11,43 triệu đồng. Dẫn đầu về số shop mới là anh Phan Đình Duy với 16 shop, chị Thái Thị Thanh Thư 15 shop, và anh Nguyễn Duy Long 13 shop.</w:t>
+            </w:r>
+          </w:p>
+          <w:p>
+            <w:pPr>
+              <w:spacing w:before="20" w:after="40" w:line="276" w:lineRule="auto"/>
+            </w:pPr>
+            <w:r>
+              <w:rPr>
+                <w:rFonts w:ascii="Arial" w:hAnsi="Arial"/>
+                <w:color w:val="334155"/>
+                <w:sz w:val="19"/>
+              </w:rPr>
+            </w:r>
+          </w:p>
+          <w:p>
+            <w:pPr>
+              <w:spacing w:before="20" w:after="40" w:line="276" w:lineRule="auto"/>
+            </w:pPr>
+            <w:r>
+              <w:rPr>
+                <w:rFonts w:ascii="Arial" w:hAnsi="Arial"/>
+                <w:color w:val="334155"/>
+                <w:sz w:val="19"/>
+              </w:rPr>
+              <w:t>Tuy nhiên, nhìn vào bảng Top sụt giảm doanh thu (Top Drop) và danh sách cảnh báo shop nhóm A, chúng ta cần lưu ý 3 trường hợp:</w:t>
+            </w:r>
+          </w:p>
+          <w:p>
+            <w:pPr>
+              <w:spacing w:before="20" w:after="40" w:line="276" w:lineRule="auto"/>
+            </w:pPr>
+            <w:r>
+              <w:rPr>
+                <w:rFonts w:ascii="Arial" w:hAnsi="Arial"/>
+                <w:color w:val="334155"/>
+                <w:sz w:val="19"/>
+              </w:rPr>
+              <w:t>1. Thứ nhất là khu vực của anh Huỳnh Thúc Duân tại Đắk Nông: Doanh thu tuần này giảm 23,44 triệu đồng (-29,1%), sản lượng giảm hơn 1.600 đơn. Trong đó, riêng Shop Nghĩa Gumi tại bưu cục Bắc Gia Nghĩa bị sụt giảm từ 167 đơn xuống chỉ còn 31 đơn (giảm hơn 81%), và Shop Đồ Bộ giảm từ 53 đơn xuống 33 đơn.</w:t>
+            </w:r>
+          </w:p>
+          <w:p>
+            <w:pPr>
+              <w:spacing w:before="20" w:after="40" w:line="276" w:lineRule="auto"/>
+            </w:pPr>
+            <w:r>
+              <w:rPr>
+                <w:rFonts w:ascii="Arial" w:hAnsi="Arial"/>
+                <w:color w:val="334155"/>
+                <w:sz w:val="19"/>
+              </w:rPr>
+              <w:t>2. Thứ hai là khu vực của chị Thái Thị Thanh Thư tại Nha Trang: Doanh thu giảm 11,77 triệu đồng, trong đó Shop Hằng Huyền tại bưu cục Nam Nha Trang 1 giảm từ 28 đơn xuống chỉ còn 1 đơn, và Khởi Phát Thịnh tại Nam Nha Trang 3 giảm 60 đơn.</w:t>
+            </w:r>
+          </w:p>
+          <w:p>
+            <w:pPr>
+              <w:spacing w:before="20" w:after="40" w:line="276" w:lineRule="auto"/>
+            </w:pPr>
+            <w:r>
+              <w:rPr>
+                <w:rFonts w:ascii="Arial" w:hAnsi="Arial"/>
+                <w:color w:val="334155"/>
+                <w:sz w:val="19"/>
+              </w:rPr>
+              <w:t>3. Thứ ba là một số shop nhóm A có dấu hiệu giảm đơn so với tuần trước cần theo dõi sát: Như Bếp vườn nhà Trinh tại Vạn Ninh (giảm 35 triệu đồng, MTD mới đạt 51% cam kết), Cám store tại B'Lao của chị Nga (giảm 29 triệu đồng, MTD đạt 74%), TIÊN HUỲNH US tại Phước Dinh của anh Duy Long, và VA Beauty Queen79 tại Đức Lập của chị Nhung.</w:t>
+            </w:r>
+          </w:p>
+          <w:p>
+            <w:pPr>
+              <w:spacing w:before="20" w:after="40" w:line="276" w:lineRule="auto"/>
+            </w:pPr>
+            <w:r>
+              <w:rPr>
+                <w:rFonts w:ascii="Arial" w:hAnsi="Arial"/>
+                <w:color w:val="334155"/>
+                <w:sz w:val="19"/>
+              </w:rPr>
+            </w:r>
+          </w:p>
+          <w:p>
+            <w:pPr>
+              <w:spacing w:before="20" w:after="40" w:line="276" w:lineRule="auto"/>
+            </w:pPr>
+            <w:r>
+              <w:rPr>
+                <w:rFonts w:ascii="Arial" w:hAnsi="Arial"/>
+                <w:b/>
+                <w:color w:val="0F172A"/>
+                <w:sz w:val="20"/>
+              </w:rPr>
+              <w:t>🔍 NGUYÊN NHÂN &amp; ĐỊNH HƯỚNG PHỐI HỢP KINH DOANH TUẦN W41:</w:t>
+            </w:r>
+          </w:p>
+          <w:p>
+            <w:pPr>
+              <w:spacing w:before="20" w:after="40" w:line="276" w:lineRule="auto"/>
+            </w:pPr>
+            <w:r>
+              <w:rPr>
+                <w:rFonts w:ascii="Arial" w:hAnsi="Arial"/>
+                <w:color w:val="334155"/>
+                <w:sz w:val="19"/>
+              </w:rPr>
+              <w:t>Nguyên nhân sụt giảm một phần do yếu tố chu kỳ đơn hàng sau đợt sale cuối tháng, nhưng phần quan trọng hơn là khách hàng nhóm A rất nhạy cảm với chất lượng lấy hàng và thời gian giao đơn sàn.</w:t>
+            </w:r>
+          </w:p>
+          <w:p>
+            <w:pPr>
+              <w:spacing w:before="20" w:after="40" w:line="276" w:lineRule="auto"/>
+            </w:pPr>
+            <w:r>
+              <w:rPr>
+                <w:rFonts w:ascii="Arial" w:hAnsi="Arial"/>
+                <w:color w:val="334155"/>
+                <w:sz w:val="19"/>
+              </w:rPr>
+              <w:t>Định hướng phối hợp tuần tới:</w:t>
+            </w:r>
+          </w:p>
+          <w:p>
+            <w:pPr>
+              <w:spacing w:before="20" w:after="40" w:line="276" w:lineRule="auto"/>
+            </w:pPr>
+            <w:r>
+              <w:rPr>
+                <w:rFonts w:ascii="Arial" w:hAnsi="Arial"/>
+                <w:color w:val="334155"/>
+                <w:sz w:val="19"/>
+              </w:rPr>
+              <w:t>- Đề nghị anh Duân, chị Thư, chị Nga và các AM chủ động phối hợp với chuyên viên kinh doanh phụ trách tài khoản để trực tiếp liên hệ và thăm gặp các chủ shop nhóm A có sản lượng sụt giảm (đặc biệt là Shop Nghĩa Gumi, Bếp vườn nhà Trinh, Cám store).</w:t>
+            </w:r>
+          </w:p>
+          <w:p>
+            <w:pPr>
+              <w:spacing w:before="20" w:after="40" w:line="276" w:lineRule="auto"/>
+            </w:pPr>
+            <w:r>
+              <w:rPr>
+                <w:rFonts w:ascii="Arial" w:hAnsi="Arial"/>
+                <w:color w:val="334155"/>
+                <w:sz w:val="19"/>
+              </w:rPr>
+              <w:t>- Lắng nghe phản hồi thực tế của khách hàng về tỷ lệ lấy đúng giờ và thời gian giao hàng, từ đó bưu cục cam kết khung giờ lấy hàng cố định và ưu tiên tuyến phát để shop yên tâm tiếp tục đẩy volume cho chúng ta.</w:t>
+            </w:r>
+          </w:p>
+          <w:p>
+            <w:pPr>
+              <w:spacing w:before="20" w:after="40" w:line="276" w:lineRule="auto"/>
+            </w:pPr>
+            <w:r>
+              <w:rPr>
+                <w:rFonts w:ascii="Arial" w:hAnsi="Arial"/>
+                <w:color w:val="334155"/>
+                <w:sz w:val="19"/>
+              </w:rPr>
+              <w:t>- Tiếp tục phát huy khí thế phát triển shop mới F30, phấn đấu đưa số lượng shop mới tuần W41 vượt mốc 120 shop.</w:t>
             </w:r>
           </w:p>
           <w:p>
@@ -9201,7 +10023,7 @@
                 <w:color w:val="0F172A"/>
                 <w:sz w:val="19"/>
               </w:rPr>
-              <w:t>Bây giờ, em xin chuyển sang Tab 16 - Danh sách 13 Bưu cục cần quan tâm &amp; Phương hướng tuần W41 ạ!"</w:t>
+              <w:t>Bây giờ, em xin phép chuyển sang Tab 16 – Danh sách 13 Bưu cục cần quan tâm &amp; 5 Trọng tâm điều hành tuần W41 ạ!"</w:t>
             </w:r>
           </w:p>
         </w:tc>

</xml_diff>